<commit_message>
Add packages.txt and updated requirements.txt
</commit_message>
<xml_diff>
--- a/AICTE_Internship_2024_Project_Report_Template_2.docx
+++ b/AICTE_Internship_2024_Project_Report_Template_2.docx
@@ -1,6 +1,6 @@
 
 <file path=word/document.xml><?xml version="1.0" encoding="utf-8"?>
-<w:document xmlns:wpc="http://schemas.microsoft.com/office/word/2010/wordprocessingCanvas" xmlns:cx="http://schemas.microsoft.com/office/drawing/2014/chartex" xmlns:cx1="http://schemas.microsoft.com/office/drawing/2015/9/8/chartex" xmlns:cx2="http://schemas.microsoft.com/office/drawing/2015/10/21/chartex" xmlns:cx3="http://schemas.microsoft.com/office/drawing/2016/5/9/chartex" xmlns:cx4="http://schemas.microsoft.com/office/drawing/2016/5/10/chartex" xmlns:cx5="http://schemas.microsoft.com/office/drawing/2016/5/11/chartex" xmlns:cx6="http://schemas.microsoft.com/office/drawing/2016/5/12/chartex" xmlns:cx7="http://schemas.microsoft.com/office/drawing/2016/5/13/chartex" xmlns:cx8="http://schemas.microsoft.com/office/drawing/2016/5/14/chartex" xmlns:mc="http://schemas.openxmlformats.org/markup-compatibility/2006" xmlns:aink="http://schemas.microsoft.com/office/drawing/2016/ink" xmlns:am3d="http://schemas.microsoft.com/office/drawing/2017/model3d" xmlns:o="urn:schemas-microsoft-com:office:office" xmlns:oel="http://schemas.microsoft.com/office/2019/extlst" xmlns:r="http://schemas.openxmlformats.org/officeDocument/2006/relationships" xmlns:m="http://schemas.openxmlformats.org/officeDocument/2006/math" xmlns:v="urn:schemas-microsoft-com:vml" xmlns:wp14="http://schemas.microsoft.com/office/word/2010/wordprocessingDrawing" xmlns:wp="http://schemas.openxmlformats.org/drawingml/2006/wordprocessingDrawing" xmlns:w10="urn:schemas-microsoft-com:office:word" xmlns:w="http://schemas.openxmlformats.org/wordprocessingml/2006/main" xmlns:w14="http://schemas.microsoft.com/office/word/2010/wordml" xmlns:w15="http://schemas.microsoft.com/office/word/2012/wordml" xmlns:w16cex="http://schemas.microsoft.com/office/word/2018/wordml/cex" xmlns:w16cid="http://schemas.microsoft.com/office/word/2016/wordml/cid" xmlns:w16="http://schemas.microsoft.com/office/word/2018/wordml" xmlns:w16du="http://schemas.microsoft.com/office/word/2023/wordml/word16du" xmlns:w16sdtdh="http://schemas.microsoft.com/office/word/2020/wordml/sdtdatahash" xmlns:w16se="http://schemas.microsoft.com/office/word/2015/wordml/symex" xmlns:wpg="http://schemas.microsoft.com/office/word/2010/wordprocessingGroup" xmlns:wpi="http://schemas.microsoft.com/office/word/2010/wordprocessingInk" xmlns:wne="http://schemas.microsoft.com/office/word/2006/wordml" xmlns:wps="http://schemas.microsoft.com/office/word/2010/wordprocessingShape" mc:Ignorable="w14 w15 w16se w16cid w16 w16cex w16sdtdh w16du wp14">
+<w:document xmlns:wpc="http://schemas.microsoft.com/office/word/2010/wordprocessingCanvas" xmlns:cx="http://schemas.microsoft.com/office/drawing/2014/chartex" xmlns:cx1="http://schemas.microsoft.com/office/drawing/2015/9/8/chartex" xmlns:cx2="http://schemas.microsoft.com/office/drawing/2015/10/21/chartex" xmlns:cx3="http://schemas.microsoft.com/office/drawing/2016/5/9/chartex" xmlns:cx4="http://schemas.microsoft.com/office/drawing/2016/5/10/chartex" xmlns:cx5="http://schemas.microsoft.com/office/drawing/2016/5/11/chartex" xmlns:cx6="http://schemas.microsoft.com/office/drawing/2016/5/12/chartex" xmlns:cx7="http://schemas.microsoft.com/office/drawing/2016/5/13/chartex" xmlns:cx8="http://schemas.microsoft.com/office/drawing/2016/5/14/chartex" xmlns:mc="http://schemas.openxmlformats.org/markup-compatibility/2006" xmlns:aink="http://schemas.microsoft.com/office/drawing/2016/ink" xmlns:am3d="http://schemas.microsoft.com/office/drawing/2017/model3d" xmlns:o="urn:schemas-microsoft-com:office:office" xmlns:oel="http://schemas.microsoft.com/office/2019/extlst" xmlns:r="http://schemas.openxmlformats.org/officeDocument/2006/relationships" xmlns:m="http://schemas.openxmlformats.org/officeDocument/2006/math" xmlns:v="urn:schemas-microsoft-com:vml" xmlns:wp14="http://schemas.microsoft.com/office/word/2010/wordprocessingDrawing" xmlns:wp="http://schemas.openxmlformats.org/drawingml/2006/wordprocessingDrawing" xmlns:w10="urn:schemas-microsoft-com:office:word" xmlns:w="http://schemas.openxmlformats.org/wordprocessingml/2006/main" xmlns:w14="http://schemas.microsoft.com/office/word/2010/wordml" xmlns:w15="http://schemas.microsoft.com/office/word/2012/wordml" xmlns:w16cex="http://schemas.microsoft.com/office/word/2018/wordml/cex" xmlns:w16cid="http://schemas.microsoft.com/office/word/2016/wordml/cid" xmlns:w16="http://schemas.microsoft.com/office/word/2018/wordml" xmlns:w16du="http://schemas.microsoft.com/office/word/2023/wordml/word16du" xmlns:w16sdtdh="http://schemas.microsoft.com/office/word/2020/wordml/sdtdatahash" xmlns:w16sdtfl="http://schemas.microsoft.com/office/word/2024/wordml/sdtformatlock" xmlns:w16se="http://schemas.microsoft.com/office/word/2015/wordml/symex" xmlns:wpg="http://schemas.microsoft.com/office/word/2010/wordprocessingGroup" xmlns:wpi="http://schemas.microsoft.com/office/word/2010/wordprocessingInk" xmlns:wne="http://schemas.microsoft.com/office/word/2006/wordml" xmlns:wps="http://schemas.microsoft.com/office/word/2010/wordprocessingShape" mc:Ignorable="w14 w15 w16se w16cid w16 w16cex w16sdtdh w16sdtfl w16du wp14">
   <w:body>
     <w:p>
       <w:pPr>
@@ -291,7 +291,7 @@
           <w:sz w:val="28"/>
           <w:szCs w:val="28"/>
         </w:rPr>
-        <w:t>gaikwadabhishek1508@gmail.com</w:t>
+        <w:t>abhishek.22210975@viit.ac.in</w:t>
       </w:r>
     </w:p>
     <w:p>
@@ -373,7 +373,34 @@
           <w:sz w:val="32"/>
           <w:szCs w:val="32"/>
         </w:rPr>
-        <w:t>Name of Guide</w:t>
+        <w:t>P</w:t>
+      </w:r>
+      <w:r>
+        <w:rPr>
+          <w:rFonts w:ascii="Times New Roman" w:hAnsi="Times New Roman"/>
+          <w:b/>
+          <w:sz w:val="32"/>
+          <w:szCs w:val="32"/>
+        </w:rPr>
+        <w:t>.</w:t>
+      </w:r>
+      <w:r>
+        <w:rPr>
+          <w:rFonts w:ascii="Times New Roman" w:hAnsi="Times New Roman"/>
+          <w:b/>
+          <w:sz w:val="32"/>
+          <w:szCs w:val="32"/>
+        </w:rPr>
+        <w:t xml:space="preserve"> Raja</w:t>
+      </w:r>
+      <w:r>
+        <w:rPr>
+          <w:rFonts w:ascii="Times New Roman" w:hAnsi="Times New Roman"/>
+          <w:b/>
+          <w:sz w:val="32"/>
+          <w:szCs w:val="32"/>
+        </w:rPr>
+        <w:t>, Master Trainer, Edunet Foundation</w:t>
       </w:r>
     </w:p>
     <w:p>
@@ -485,6 +512,7 @@
           <w:rFonts w:ascii="Times New Roman" w:hAnsi="Times New Roman"/>
           <w:sz w:val="24"/>
           <w:szCs w:val="24"/>
+          <w:lang w:val="en-IN"/>
         </w:rPr>
       </w:pPr>
       <w:r>
@@ -494,7 +522,23 @@
           <w:szCs w:val="24"/>
         </w:rPr>
         <w:tab/>
-        <w:t xml:space="preserve"> We would like to take this opportunity to express our deep sense of gratitude to all individuals who helped us directly or indirectly during this thesis work. </w:t>
+      </w:r>
+      <w:r>
+        <w:rPr>
+          <w:rFonts w:ascii="Times New Roman" w:hAnsi="Times New Roman"/>
+          <w:sz w:val="24"/>
+          <w:szCs w:val="24"/>
+        </w:rPr>
+        <w:t xml:space="preserve"> </w:t>
+      </w:r>
+      <w:r>
+        <w:rPr>
+          <w:rFonts w:ascii="Times New Roman" w:hAnsi="Times New Roman"/>
+          <w:sz w:val="24"/>
+          <w:szCs w:val="24"/>
+          <w:lang w:val="en-IN"/>
+        </w:rPr>
+        <w:t>I would like to take this opportunity to express my deep sense of gratitude to all those individuals who supported and guided me during this project.</w:t>
       </w:r>
     </w:p>
     <w:p>
@@ -508,8 +552,36 @@
           <w:rFonts w:ascii="Times New Roman" w:hAnsi="Times New Roman"/>
           <w:sz w:val="24"/>
           <w:szCs w:val="24"/>
-        </w:rPr>
-      </w:pPr>
+          <w:lang w:val="en-IN"/>
+        </w:rPr>
+      </w:pPr>
+      <w:r>
+        <w:rPr>
+          <w:rFonts w:ascii="Times New Roman" w:hAnsi="Times New Roman"/>
+          <w:sz w:val="24"/>
+          <w:szCs w:val="24"/>
+          <w:lang w:val="en-IN"/>
+        </w:rPr>
+        <w:t>First and foremost, I extend my heartfelt thanks to my mentor</w:t>
+      </w:r>
+      <w:r>
+        <w:rPr>
+          <w:rFonts w:ascii="Times New Roman" w:hAnsi="Times New Roman"/>
+          <w:sz w:val="24"/>
+          <w:szCs w:val="24"/>
+          <w:lang w:val="en-IN"/>
+        </w:rPr>
+        <w:t xml:space="preserve"> P. Raja Sir, Pavan Sir, and all other faculties</w:t>
+      </w:r>
+      <w:r>
+        <w:rPr>
+          <w:rFonts w:ascii="Times New Roman" w:hAnsi="Times New Roman"/>
+          <w:sz w:val="24"/>
+          <w:szCs w:val="24"/>
+          <w:lang w:val="en-IN"/>
+        </w:rPr>
+        <w:t xml:space="preserve"> for their invaluable guidance and encouragement. Their insightful advice, constructive criticism, and consistent support have been the driving force behind the successful completion of this project. Working under their mentorship has been a privilege, and their belief in my abilities has inspired me to give my best effort.</w:t>
+      </w:r>
     </w:p>
     <w:p>
       <w:pPr>
@@ -520,185 +592,99 @@
         <w:jc w:val="both"/>
         <w:rPr>
           <w:rFonts w:ascii="Times New Roman" w:hAnsi="Times New Roman"/>
-        </w:rPr>
-      </w:pPr>
-      <w:r>
-        <w:rPr>
-          <w:rFonts w:ascii="Times New Roman" w:hAnsi="Times New Roman"/>
-          <w:sz w:val="24"/>
-          <w:szCs w:val="24"/>
-        </w:rPr>
-        <w:t>Firstly, we would like to thank my supervisor, …………</w:t>
-      </w:r>
-      <w:proofErr w:type="gramStart"/>
-      <w:r>
-        <w:rPr>
-          <w:rFonts w:ascii="Times New Roman" w:hAnsi="Times New Roman"/>
-          <w:sz w:val="24"/>
-          <w:szCs w:val="24"/>
-        </w:rPr>
-        <w:t>…..</w:t>
-      </w:r>
-      <w:proofErr w:type="gramEnd"/>
-      <w:r>
-        <w:rPr>
-          <w:rFonts w:ascii="Times New Roman" w:hAnsi="Times New Roman"/>
-          <w:sz w:val="24"/>
-          <w:szCs w:val="24"/>
-        </w:rPr>
-        <w:t xml:space="preserve">, for being a great mentor and the best adviser I could ever have. His advice, encouragement and </w:t>
-      </w:r>
-      <w:r>
-        <w:rPr>
-          <w:rFonts w:ascii="Times New Roman" w:hAnsi="Times New Roman"/>
-          <w:sz w:val="24"/>
-          <w:szCs w:val="24"/>
-        </w:rPr>
-        <w:t xml:space="preserve">the </w:t>
-      </w:r>
-      <w:r>
-        <w:rPr>
-          <w:rFonts w:ascii="Times New Roman" w:hAnsi="Times New Roman"/>
-          <w:sz w:val="24"/>
-          <w:szCs w:val="24"/>
-        </w:rPr>
-        <w:t xml:space="preserve">critics are </w:t>
-      </w:r>
-      <w:r>
-        <w:rPr>
-          <w:rFonts w:ascii="Times New Roman" w:hAnsi="Times New Roman"/>
-          <w:sz w:val="24"/>
-          <w:szCs w:val="24"/>
-        </w:rPr>
-        <w:t xml:space="preserve">a </w:t>
-      </w:r>
-      <w:r>
-        <w:rPr>
-          <w:rFonts w:ascii="Times New Roman" w:hAnsi="Times New Roman"/>
-          <w:sz w:val="24"/>
-          <w:szCs w:val="24"/>
-        </w:rPr>
-        <w:t xml:space="preserve">source of innovative ideas, inspiration and causes behind the successful completion of this </w:t>
-      </w:r>
-      <w:r>
-        <w:rPr>
-          <w:rFonts w:ascii="Times New Roman" w:hAnsi="Times New Roman"/>
-          <w:sz w:val="24"/>
-          <w:szCs w:val="24"/>
-        </w:rPr>
-        <w:t>project</w:t>
-      </w:r>
-      <w:r>
-        <w:rPr>
-          <w:rFonts w:ascii="Times New Roman" w:hAnsi="Times New Roman"/>
-          <w:sz w:val="24"/>
-          <w:szCs w:val="24"/>
-        </w:rPr>
-        <w:t xml:space="preserve">. The confidence shown </w:t>
-      </w:r>
-      <w:r>
-        <w:rPr>
-          <w:rFonts w:ascii="Times New Roman" w:hAnsi="Times New Roman"/>
-          <w:sz w:val="24"/>
-          <w:szCs w:val="24"/>
-        </w:rPr>
-        <w:t>in</w:t>
-      </w:r>
-      <w:r>
-        <w:rPr>
-          <w:rFonts w:ascii="Times New Roman" w:hAnsi="Times New Roman"/>
-          <w:sz w:val="24"/>
-          <w:szCs w:val="24"/>
-        </w:rPr>
-        <w:t xml:space="preserve"> me by him was the biggest source of inspiration for me. It has been a privilege working with him f</w:t>
-      </w:r>
-      <w:r>
-        <w:rPr>
-          <w:rFonts w:ascii="Times New Roman" w:hAnsi="Times New Roman"/>
-          <w:sz w:val="24"/>
-          <w:szCs w:val="24"/>
-        </w:rPr>
-        <w:t xml:space="preserve">or the </w:t>
-      </w:r>
-      <w:r>
-        <w:rPr>
-          <w:rFonts w:ascii="Times New Roman" w:hAnsi="Times New Roman"/>
-          <w:sz w:val="24"/>
-          <w:szCs w:val="24"/>
-        </w:rPr>
-        <w:t xml:space="preserve">last one year. He always helped me during my </w:t>
-      </w:r>
-      <w:r>
-        <w:rPr>
-          <w:rFonts w:ascii="Times New Roman" w:hAnsi="Times New Roman"/>
-          <w:sz w:val="24"/>
-          <w:szCs w:val="24"/>
-        </w:rPr>
-        <w:t>project</w:t>
-      </w:r>
-      <w:r>
-        <w:rPr>
-          <w:rFonts w:ascii="Times New Roman" w:hAnsi="Times New Roman"/>
-          <w:sz w:val="24"/>
-          <w:szCs w:val="24"/>
-        </w:rPr>
-        <w:t xml:space="preserve"> and many other aspects related to </w:t>
-      </w:r>
-      <w:r>
-        <w:rPr>
-          <w:rFonts w:ascii="Times New Roman" w:hAnsi="Times New Roman"/>
-          <w:sz w:val="24"/>
-          <w:szCs w:val="24"/>
-        </w:rPr>
-        <w:t xml:space="preserve">the </w:t>
-      </w:r>
-      <w:r>
-        <w:rPr>
-          <w:rFonts w:ascii="Times New Roman" w:hAnsi="Times New Roman"/>
-          <w:sz w:val="24"/>
-          <w:szCs w:val="24"/>
-        </w:rPr>
-        <w:t>program</w:t>
-      </w:r>
-      <w:r>
-        <w:rPr>
-          <w:rFonts w:ascii="Times New Roman" w:hAnsi="Times New Roman"/>
-          <w:sz w:val="24"/>
-          <w:szCs w:val="24"/>
-        </w:rPr>
-        <w:t xml:space="preserve">. His talks and lessons not only help in </w:t>
-      </w:r>
-      <w:r>
-        <w:rPr>
-          <w:rFonts w:ascii="Times New Roman" w:hAnsi="Times New Roman"/>
-          <w:sz w:val="24"/>
-          <w:szCs w:val="24"/>
-        </w:rPr>
-        <w:t>project</w:t>
-      </w:r>
-      <w:r>
-        <w:rPr>
-          <w:rFonts w:ascii="Times New Roman" w:hAnsi="Times New Roman"/>
-          <w:sz w:val="24"/>
-          <w:szCs w:val="24"/>
-        </w:rPr>
-        <w:t xml:space="preserve"> work and other activities of </w:t>
-      </w:r>
-      <w:r>
-        <w:rPr>
-          <w:rFonts w:ascii="Times New Roman" w:hAnsi="Times New Roman"/>
-          <w:sz w:val="24"/>
-          <w:szCs w:val="24"/>
-        </w:rPr>
-        <w:t>the program b</w:t>
-      </w:r>
-      <w:r>
-        <w:rPr>
-          <w:rFonts w:ascii="Times New Roman" w:hAnsi="Times New Roman"/>
-          <w:sz w:val="24"/>
-          <w:szCs w:val="24"/>
-        </w:rPr>
-        <w:t>ut also make me a good and responsible professional.</w:t>
+          <w:sz w:val="24"/>
+          <w:szCs w:val="24"/>
+          <w:lang w:val="en-IN"/>
+        </w:rPr>
+      </w:pPr>
+      <w:r>
+        <w:rPr>
+          <w:rFonts w:ascii="Times New Roman" w:hAnsi="Times New Roman"/>
+          <w:sz w:val="24"/>
+          <w:szCs w:val="24"/>
+          <w:lang w:val="en-IN"/>
+        </w:rPr>
+        <w:t xml:space="preserve">I am also deeply grateful to </w:t>
+      </w:r>
+      <w:r>
+        <w:rPr>
+          <w:rFonts w:ascii="Times New Roman" w:hAnsi="Times New Roman"/>
+          <w:b/>
+          <w:bCs/>
+          <w:sz w:val="24"/>
+          <w:szCs w:val="24"/>
+          <w:lang w:val="en-IN"/>
+        </w:rPr>
+        <w:t>Microsoft</w:t>
+      </w:r>
+      <w:r>
+        <w:rPr>
+          <w:rFonts w:ascii="Times New Roman" w:hAnsi="Times New Roman"/>
+          <w:sz w:val="24"/>
+          <w:szCs w:val="24"/>
+          <w:lang w:val="en-IN"/>
+        </w:rPr>
+        <w:t xml:space="preserve">, </w:t>
+      </w:r>
+      <w:r>
+        <w:rPr>
+          <w:rFonts w:ascii="Times New Roman" w:hAnsi="Times New Roman"/>
+          <w:b/>
+          <w:bCs/>
+          <w:sz w:val="24"/>
+          <w:szCs w:val="24"/>
+          <w:lang w:val="en-IN"/>
+        </w:rPr>
+        <w:t>SAP</w:t>
+      </w:r>
+      <w:r>
+        <w:rPr>
+          <w:rFonts w:ascii="Times New Roman" w:hAnsi="Times New Roman"/>
+          <w:sz w:val="24"/>
+          <w:szCs w:val="24"/>
+          <w:lang w:val="en-IN"/>
+        </w:rPr>
+        <w:t xml:space="preserve">, and </w:t>
+      </w:r>
+      <w:r>
+        <w:rPr>
+          <w:rFonts w:ascii="Times New Roman" w:hAnsi="Times New Roman"/>
+          <w:b/>
+          <w:bCs/>
+          <w:sz w:val="24"/>
+          <w:szCs w:val="24"/>
+          <w:lang w:val="en-IN"/>
+        </w:rPr>
+        <w:t>AICTE</w:t>
+      </w:r>
+      <w:r>
+        <w:rPr>
+          <w:rFonts w:ascii="Times New Roman" w:hAnsi="Times New Roman"/>
+          <w:sz w:val="24"/>
+          <w:szCs w:val="24"/>
+          <w:lang w:val="en-IN"/>
+        </w:rPr>
+        <w:t xml:space="preserve"> for organizing the </w:t>
+      </w:r>
+      <w:r>
+        <w:rPr>
+          <w:rFonts w:ascii="Times New Roman" w:hAnsi="Times New Roman"/>
+          <w:b/>
+          <w:bCs/>
+          <w:sz w:val="24"/>
+          <w:szCs w:val="24"/>
+          <w:lang w:val="en-IN"/>
+        </w:rPr>
+        <w:t>TechSaksham Internship</w:t>
+      </w:r>
+      <w:r>
+        <w:rPr>
+          <w:rFonts w:ascii="Times New Roman" w:hAnsi="Times New Roman"/>
+          <w:sz w:val="24"/>
+          <w:szCs w:val="24"/>
+          <w:lang w:val="en-IN"/>
+        </w:rPr>
+        <w:t xml:space="preserve"> and providing a platform to explore innovative solutions in the field of Artificial Intelligence. The structured guidance and mentorship sessions offered during the program have significantly enriched my learning experience.</w:t>
       </w:r>
     </w:p>
     <w:p>
@@ -710,8 +696,20 @@
         <w:jc w:val="both"/>
         <w:rPr>
           <w:rFonts w:ascii="Times New Roman" w:hAnsi="Times New Roman"/>
-        </w:rPr>
-      </w:pPr>
+          <w:sz w:val="24"/>
+          <w:szCs w:val="24"/>
+          <w:lang w:val="en-IN"/>
+        </w:rPr>
+      </w:pPr>
+      <w:r>
+        <w:rPr>
+          <w:rFonts w:ascii="Times New Roman" w:hAnsi="Times New Roman"/>
+          <w:sz w:val="24"/>
+          <w:szCs w:val="24"/>
+          <w:lang w:val="en-IN"/>
+        </w:rPr>
+        <w:t>I would also like to express my gratitude to my family, friends, and peers for their continuous support and motivation throughout this journey. Their encouragement and confidence in me have been my strength in overcoming challenges.</w:t>
+      </w:r>
     </w:p>
     <w:p>
       <w:pPr>
@@ -722,126 +720,44 @@
         <w:jc w:val="both"/>
         <w:rPr>
           <w:rFonts w:ascii="Times New Roman" w:hAnsi="Times New Roman"/>
-        </w:rPr>
-      </w:pPr>
-      <w:r>
-        <w:rPr>
-          <w:rFonts w:ascii="Times New Roman" w:hAnsi="Times New Roman"/>
-        </w:rPr>
-        <w:t>……...</w:t>
-      </w:r>
-    </w:p>
-    <w:p>
-      <w:pPr>
-        <w:pStyle w:val="Heading4"/>
-        <w:tabs>
-          <w:tab w:val="center" w:pos="6660"/>
-        </w:tabs>
-        <w:spacing w:after="120"/>
-        <w:jc w:val="right"/>
-        <w:rPr>
-          <w:rFonts w:ascii="Times New Roman" w:hAnsi="Times New Roman" w:cs="Times New Roman"/>
-          <w:b/>
-          <w:bCs/>
-          <w:sz w:val="24"/>
-          <w:szCs w:val="24"/>
-        </w:rPr>
-      </w:pPr>
-    </w:p>
-    <w:p>
-      <w:pPr>
-        <w:pStyle w:val="Heading4"/>
-        <w:tabs>
-          <w:tab w:val="center" w:pos="6660"/>
-        </w:tabs>
-        <w:spacing w:after="120"/>
-        <w:rPr>
-          <w:rFonts w:ascii="Times New Roman" w:hAnsi="Times New Roman" w:cs="Times New Roman"/>
-          <w:b/>
-          <w:bCs/>
-          <w:sz w:val="36"/>
-          <w:szCs w:val="24"/>
-        </w:rPr>
-      </w:pPr>
-      <w:r>
-        <w:rPr>
-          <w:rFonts w:ascii="Times New Roman" w:hAnsi="Times New Roman" w:cs="Times New Roman"/>
-          <w:sz w:val="36"/>
-          <w:szCs w:val="24"/>
-        </w:rPr>
-        <w:t>This Acknowledgement should be written by students in your own language (Do not copy and Paste)</w:t>
-      </w:r>
-    </w:p>
-    <w:p>
-      <w:pPr>
-        <w:pStyle w:val="Heading4"/>
-        <w:tabs>
-          <w:tab w:val="center" w:pos="6660"/>
-        </w:tabs>
-        <w:spacing w:after="120"/>
-        <w:jc w:val="right"/>
-        <w:rPr>
-          <w:rFonts w:ascii="Times New Roman" w:hAnsi="Times New Roman" w:cs="Times New Roman"/>
-          <w:b/>
-          <w:bCs/>
-          <w:sz w:val="24"/>
-          <w:szCs w:val="24"/>
-        </w:rPr>
-      </w:pPr>
-      <w:r>
-        <w:rPr>
-          <w:rFonts w:ascii="Times New Roman" w:hAnsi="Times New Roman" w:cs="Times New Roman"/>
-          <w:sz w:val="24"/>
-          <w:szCs w:val="24"/>
-        </w:rPr>
-        <w:t>…..</w:t>
-      </w:r>
-    </w:p>
-    <w:p>
-      <w:pPr>
-        <w:rPr>
-          <w:rFonts w:ascii="Times New Roman" w:hAnsi="Times New Roman"/>
-        </w:rPr>
-      </w:pPr>
-      <w:r>
-        <w:rPr>
-          <w:rFonts w:ascii="Times New Roman" w:hAnsi="Times New Roman"/>
-        </w:rPr>
-        <w:t>……</w:t>
-      </w:r>
-    </w:p>
-    <w:p>
-      <w:pPr>
-        <w:rPr>
-          <w:rFonts w:ascii="Times New Roman" w:hAnsi="Times New Roman"/>
-        </w:rPr>
-      </w:pPr>
-      <w:r>
-        <w:rPr>
-          <w:rFonts w:ascii="Times New Roman" w:hAnsi="Times New Roman"/>
-        </w:rPr>
-        <w:t>….</w:t>
-      </w:r>
-    </w:p>
-    <w:p>
-      <w:pPr>
-        <w:rPr>
-          <w:rFonts w:ascii="Times New Roman" w:hAnsi="Times New Roman"/>
-        </w:rPr>
-      </w:pPr>
-      <w:r>
-        <w:rPr>
-          <w:rFonts w:ascii="Times New Roman" w:hAnsi="Times New Roman"/>
-        </w:rPr>
-        <w:t>……</w:t>
-      </w:r>
-    </w:p>
-    <w:p>
-      <w:pPr>
-        <w:rPr>
-          <w:rFonts w:ascii="Times New Roman" w:hAnsi="Times New Roman"/>
-        </w:rPr>
-      </w:pPr>
+          <w:sz w:val="24"/>
+          <w:szCs w:val="24"/>
+          <w:lang w:val="en-IN"/>
+        </w:rPr>
+      </w:pPr>
+      <w:r>
+        <w:rPr>
+          <w:rFonts w:ascii="Times New Roman" w:hAnsi="Times New Roman"/>
+          <w:sz w:val="24"/>
+          <w:szCs w:val="24"/>
+          <w:lang w:val="en-IN"/>
+        </w:rPr>
+        <w:t>This project has been an incredible learning experience, and I am thankful for the knowledge, skills, and exposure gained during this journey. It has been a transformative milestone in my professional growth.</w:t>
+      </w:r>
+    </w:p>
+    <w:p>
+      <w:pPr>
+        <w:autoSpaceDE w:val="0"/>
+        <w:autoSpaceDN w:val="0"/>
+        <w:adjustRightInd w:val="0"/>
+        <w:spacing w:line="360" w:lineRule="auto"/>
+        <w:jc w:val="both"/>
+        <w:rPr>
+          <w:rFonts w:ascii="Times New Roman" w:hAnsi="Times New Roman"/>
+          <w:b/>
+          <w:bCs/>
+          <w:sz w:val="24"/>
+          <w:szCs w:val="24"/>
+        </w:rPr>
+      </w:pPr>
+      <w:r>
+        <w:rPr>
+          <w:rFonts w:ascii="Times New Roman" w:hAnsi="Times New Roman"/>
+          <w:sz w:val="24"/>
+          <w:szCs w:val="24"/>
+        </w:rPr>
+        <w:br w:type="page"/>
+      </w:r>
     </w:p>
     <w:p>
       <w:pPr>
@@ -858,18 +774,10 @@
           <w:rFonts w:ascii="Times New Roman" w:hAnsi="Times New Roman" w:cs="Times New Roman"/>
           <w:b/>
           <w:bCs/>
-          <w:sz w:val="24"/>
-          <w:szCs w:val="24"/>
-        </w:rPr>
-      </w:pPr>
-      <w:r>
-        <w:rPr>
-          <w:rFonts w:ascii="Times New Roman" w:hAnsi="Times New Roman" w:cs="Times New Roman"/>
-          <w:sz w:val="24"/>
-          <w:szCs w:val="24"/>
-        </w:rPr>
-        <w:br w:type="page"/>
-      </w:r>
+          <w:sz w:val="36"/>
+          <w:szCs w:val="36"/>
+        </w:rPr>
+      </w:pPr>
     </w:p>
     <w:p>
       <w:pPr>
@@ -886,26 +794,6 @@
           <w:rFonts w:ascii="Times New Roman" w:hAnsi="Times New Roman" w:cs="Times New Roman"/>
           <w:b/>
           <w:bCs/>
-          <w:sz w:val="36"/>
-          <w:szCs w:val="36"/>
-        </w:rPr>
-      </w:pPr>
-    </w:p>
-    <w:p>
-      <w:pPr>
-        <w:pStyle w:val="Heading4"/>
-        <w:pBdr>
-          <w:bottom w:val="single" w:sz="4" w:space="1" w:color="auto"/>
-        </w:pBdr>
-        <w:tabs>
-          <w:tab w:val="center" w:pos="6660"/>
-        </w:tabs>
-        <w:spacing w:after="120"/>
-        <w:jc w:val="center"/>
-        <w:rPr>
-          <w:rFonts w:ascii="Times New Roman" w:hAnsi="Times New Roman" w:cs="Times New Roman"/>
-          <w:b/>
-          <w:bCs/>
           <w:i w:val="0"/>
           <w:iCs w:val="0"/>
           <w:sz w:val="28"/>
@@ -1295,7 +1183,6 @@
     <w:p>
       <w:pPr>
         <w:spacing w:after="120" w:line="360" w:lineRule="auto"/>
-        <w:ind w:firstLine="288"/>
         <w:jc w:val="both"/>
         <w:rPr>
           <w:rFonts w:ascii="Times New Roman" w:hAnsi="Times New Roman"/>
@@ -1754,7 +1641,7 @@
           <w:sz w:val="24"/>
           <w:szCs w:val="24"/>
         </w:rPr>
-        <w:t>2</w:t>
+        <w:t>3</w:t>
       </w:r>
     </w:p>
     <w:p>
@@ -1820,7 +1707,7 @@
           <w:sz w:val="24"/>
           <w:szCs w:val="24"/>
         </w:rPr>
-        <w:t>3</w:t>
+        <w:t>5</w:t>
       </w:r>
     </w:p>
     <w:p>
@@ -1878,6 +1765,16 @@
         </w:rPr>
         <w:tab/>
       </w:r>
+      <w:r>
+        <w:rPr>
+          <w:rFonts w:ascii="Times New Roman" w:hAnsi="Times New Roman"/>
+          <w:b/>
+          <w:bCs/>
+          <w:sz w:val="24"/>
+          <w:szCs w:val="24"/>
+        </w:rPr>
+        <w:t>8</w:t>
+      </w:r>
     </w:p>
     <w:p>
       <w:pPr>
@@ -1934,6 +1831,16 @@
         </w:rPr>
         <w:tab/>
       </w:r>
+      <w:r>
+        <w:rPr>
+          <w:rFonts w:ascii="Times New Roman" w:hAnsi="Times New Roman"/>
+          <w:b/>
+          <w:bCs/>
+          <w:sz w:val="24"/>
+          <w:szCs w:val="24"/>
+        </w:rPr>
+        <w:t>11</w:t>
+      </w:r>
     </w:p>
     <w:p>
       <w:pPr>
@@ -2002,6 +1909,16 @@
         </w:rPr>
         <w:tab/>
       </w:r>
+      <w:r>
+        <w:rPr>
+          <w:rFonts w:ascii="Times New Roman" w:hAnsi="Times New Roman"/>
+          <w:b/>
+          <w:bCs/>
+          <w:sz w:val="24"/>
+          <w:szCs w:val="24"/>
+        </w:rPr>
+        <w:t>15</w:t>
+      </w:r>
     </w:p>
     <w:p>
       <w:pPr>
@@ -2045,213 +1962,14 @@
         </w:rPr>
         <w:tab/>
       </w:r>
-    </w:p>
-    <w:p>
-      <w:pPr>
-        <w:spacing w:after="120"/>
-        <w:ind w:left="1260" w:hanging="1260"/>
-        <w:rPr>
-          <w:rFonts w:ascii="Times New Roman" w:hAnsi="Times New Roman"/>
-          <w:b/>
-          <w:bCs/>
-        </w:rPr>
-      </w:pPr>
-    </w:p>
-    <w:p>
-      <w:pPr>
-        <w:spacing w:after="120"/>
-        <w:ind w:left="1260" w:hanging="1260"/>
-        <w:rPr>
-          <w:rFonts w:ascii="Times New Roman" w:hAnsi="Times New Roman"/>
-          <w:b/>
-          <w:bCs/>
-        </w:rPr>
-      </w:pPr>
-    </w:p>
-    <w:p>
-      <w:pPr>
-        <w:spacing w:after="120"/>
-        <w:ind w:left="1260" w:hanging="1260"/>
-        <w:rPr>
-          <w:rFonts w:ascii="Times New Roman" w:hAnsi="Times New Roman"/>
-          <w:b/>
-          <w:bCs/>
-        </w:rPr>
-      </w:pPr>
-    </w:p>
-    <w:p>
-      <w:pPr>
-        <w:spacing w:after="120"/>
-        <w:ind w:left="1260" w:hanging="1260"/>
-        <w:rPr>
-          <w:rFonts w:ascii="Times New Roman" w:hAnsi="Times New Roman"/>
-          <w:b/>
-          <w:bCs/>
-        </w:rPr>
-      </w:pPr>
-    </w:p>
-    <w:p>
-      <w:pPr>
-        <w:spacing w:after="120"/>
-        <w:ind w:left="1260" w:hanging="1260"/>
-        <w:rPr>
-          <w:rFonts w:ascii="Times New Roman" w:hAnsi="Times New Roman"/>
-          <w:b/>
-          <w:bCs/>
-        </w:rPr>
-      </w:pPr>
-    </w:p>
-    <w:p>
-      <w:pPr>
-        <w:spacing w:after="120"/>
-        <w:ind w:left="1260" w:hanging="1260"/>
-        <w:rPr>
-          <w:rFonts w:ascii="Times New Roman" w:hAnsi="Times New Roman"/>
-          <w:b/>
-          <w:bCs/>
-        </w:rPr>
-      </w:pPr>
-    </w:p>
-    <w:p>
-      <w:pPr>
-        <w:spacing w:after="120"/>
-        <w:ind w:left="1260" w:hanging="1260"/>
-        <w:rPr>
-          <w:rFonts w:ascii="Times New Roman" w:hAnsi="Times New Roman"/>
-          <w:b/>
-          <w:bCs/>
-        </w:rPr>
-      </w:pPr>
-    </w:p>
-    <w:p>
-      <w:pPr>
-        <w:spacing w:after="120"/>
-        <w:ind w:left="1260" w:hanging="1260"/>
-        <w:rPr>
-          <w:rFonts w:ascii="Times New Roman" w:hAnsi="Times New Roman"/>
-          <w:b/>
-          <w:bCs/>
-        </w:rPr>
-      </w:pPr>
-    </w:p>
-    <w:p>
-      <w:pPr>
-        <w:spacing w:after="120"/>
-        <w:ind w:left="1260" w:hanging="1260"/>
-        <w:rPr>
-          <w:rFonts w:ascii="Times New Roman" w:hAnsi="Times New Roman"/>
-          <w:b/>
-          <w:bCs/>
-        </w:rPr>
-      </w:pPr>
-    </w:p>
-    <w:p>
-      <w:pPr>
-        <w:spacing w:after="120"/>
-        <w:ind w:left="1260" w:hanging="1260"/>
-        <w:rPr>
-          <w:rFonts w:ascii="Times New Roman" w:hAnsi="Times New Roman"/>
-          <w:b/>
-          <w:bCs/>
-        </w:rPr>
-      </w:pPr>
-    </w:p>
-    <w:p>
-      <w:pPr>
-        <w:spacing w:after="120"/>
-        <w:ind w:left="1260" w:hanging="1260"/>
-        <w:rPr>
-          <w:rFonts w:ascii="Times New Roman" w:hAnsi="Times New Roman"/>
-          <w:b/>
-          <w:bCs/>
-        </w:rPr>
-      </w:pPr>
-    </w:p>
-    <w:p>
-      <w:pPr>
-        <w:spacing w:after="120"/>
-        <w:ind w:left="1260" w:hanging="1260"/>
-        <w:rPr>
-          <w:rFonts w:ascii="Times New Roman" w:hAnsi="Times New Roman"/>
-          <w:b/>
-          <w:bCs/>
-        </w:rPr>
-      </w:pPr>
-    </w:p>
-    <w:p>
-      <w:pPr>
-        <w:spacing w:after="120"/>
-        <w:ind w:left="1260" w:hanging="1260"/>
-        <w:rPr>
-          <w:rFonts w:ascii="Times New Roman" w:hAnsi="Times New Roman"/>
-          <w:b/>
-          <w:bCs/>
-        </w:rPr>
-      </w:pPr>
-    </w:p>
-    <w:p>
-      <w:pPr>
-        <w:spacing w:after="120"/>
-        <w:ind w:left="1260" w:hanging="1260"/>
-        <w:rPr>
-          <w:rFonts w:ascii="Times New Roman" w:hAnsi="Times New Roman"/>
-          <w:b/>
-          <w:bCs/>
-        </w:rPr>
-      </w:pPr>
-    </w:p>
-    <w:p>
-      <w:pPr>
-        <w:spacing w:after="120"/>
-        <w:ind w:left="1260" w:hanging="1260"/>
-        <w:rPr>
-          <w:rFonts w:ascii="Times New Roman" w:hAnsi="Times New Roman"/>
-          <w:b/>
-          <w:bCs/>
-        </w:rPr>
-      </w:pPr>
-    </w:p>
-    <w:p>
-      <w:pPr>
-        <w:spacing w:after="120"/>
-        <w:ind w:left="1260" w:hanging="1260"/>
-        <w:rPr>
-          <w:rFonts w:ascii="Times New Roman" w:hAnsi="Times New Roman"/>
-          <w:b/>
-          <w:bCs/>
-        </w:rPr>
-      </w:pPr>
-    </w:p>
-    <w:p>
-      <w:pPr>
-        <w:spacing w:after="120"/>
-        <w:ind w:left="1260" w:hanging="1260"/>
-        <w:rPr>
-          <w:rFonts w:ascii="Times New Roman" w:hAnsi="Times New Roman"/>
-          <w:b/>
-          <w:bCs/>
-        </w:rPr>
-      </w:pPr>
-    </w:p>
-    <w:p>
-      <w:pPr>
-        <w:spacing w:after="120"/>
-        <w:ind w:left="1260" w:hanging="1260"/>
-        <w:rPr>
-          <w:rFonts w:ascii="Times New Roman" w:hAnsi="Times New Roman"/>
-          <w:b/>
-          <w:bCs/>
-        </w:rPr>
-      </w:pPr>
-    </w:p>
-    <w:p>
-      <w:pPr>
-        <w:spacing w:after="120"/>
-        <w:rPr>
-          <w:rFonts w:ascii="Times New Roman" w:hAnsi="Times New Roman"/>
-          <w:b/>
-        </w:rPr>
-      </w:pPr>
+      <w:r>
+        <w:rPr>
+          <w:rFonts w:ascii="Times New Roman" w:hAnsi="Times New Roman"/>
+          <w:sz w:val="24"/>
+          <w:szCs w:val="24"/>
+        </w:rPr>
+        <w:t>17</w:t>
+      </w:r>
     </w:p>
     <w:p>
       <w:pPr>
@@ -2276,6 +1994,7 @@
           <w:sz w:val="28"/>
           <w:szCs w:val="28"/>
         </w:rPr>
+        <w:lastRenderedPageBreak/>
         <w:t>LIST OF FIGURES</w:t>
       </w:r>
     </w:p>
@@ -2314,12 +2033,16 @@
               <w:rPr>
                 <w:rFonts w:ascii="Times New Roman" w:hAnsi="Times New Roman"/>
                 <w:b/>
+                <w:sz w:val="24"/>
+                <w:szCs w:val="24"/>
               </w:rPr>
             </w:pPr>
             <w:r>
               <w:rPr>
                 <w:rFonts w:ascii="Times New Roman" w:hAnsi="Times New Roman"/>
                 <w:b/>
+                <w:sz w:val="24"/>
+                <w:szCs w:val="24"/>
               </w:rPr>
               <w:t>Figure No.</w:t>
             </w:r>
@@ -2337,12 +2060,16 @@
               <w:rPr>
                 <w:rFonts w:ascii="Times New Roman" w:hAnsi="Times New Roman"/>
                 <w:b/>
+                <w:sz w:val="24"/>
+                <w:szCs w:val="24"/>
               </w:rPr>
             </w:pPr>
             <w:r>
               <w:rPr>
                 <w:rFonts w:ascii="Times New Roman" w:hAnsi="Times New Roman"/>
                 <w:b/>
+                <w:sz w:val="24"/>
+                <w:szCs w:val="24"/>
               </w:rPr>
               <w:t>Figure Caption</w:t>
             </w:r>
@@ -2360,12 +2087,16 @@
               <w:rPr>
                 <w:rFonts w:ascii="Times New Roman" w:hAnsi="Times New Roman"/>
                 <w:b/>
+                <w:sz w:val="24"/>
+                <w:szCs w:val="24"/>
               </w:rPr>
             </w:pPr>
             <w:r>
               <w:rPr>
                 <w:rFonts w:ascii="Times New Roman" w:hAnsi="Times New Roman"/>
                 <w:b/>
+                <w:sz w:val="24"/>
+                <w:szCs w:val="24"/>
               </w:rPr>
               <w:t>Page No.</w:t>
             </w:r>
@@ -2392,6 +2123,8 @@
               <w:rPr>
                 <w:rFonts w:ascii="Times New Roman" w:hAnsi="Times New Roman"/>
                 <w:b/>
+                <w:sz w:val="24"/>
+                <w:szCs w:val="24"/>
               </w:rPr>
             </w:pPr>
           </w:p>
@@ -2402,11 +2135,24 @@
           </w:tcPr>
           <w:p>
             <w:pPr>
+              <w:tabs>
+                <w:tab w:val="left" w:pos="1560"/>
+              </w:tabs>
               <w:spacing w:after="120"/>
               <w:rPr>
                 <w:rFonts w:ascii="Times New Roman" w:hAnsi="Times New Roman"/>
+                <w:sz w:val="24"/>
+                <w:szCs w:val="24"/>
               </w:rPr>
             </w:pPr>
+            <w:r>
+              <w:rPr>
+                <w:rFonts w:ascii="Times New Roman" w:hAnsi="Times New Roman"/>
+                <w:sz w:val="24"/>
+                <w:szCs w:val="24"/>
+              </w:rPr>
+              <w:t>Flowchart illustrating the system design</w:t>
+            </w:r>
           </w:p>
         </w:tc>
         <w:tc>
@@ -2421,8 +2167,19 @@
               <w:rPr>
                 <w:rFonts w:ascii="Times New Roman" w:hAnsi="Times New Roman"/>
                 <w:b/>
+                <w:sz w:val="24"/>
+                <w:szCs w:val="24"/>
               </w:rPr>
             </w:pPr>
+            <w:r>
+              <w:rPr>
+                <w:rFonts w:ascii="Times New Roman" w:hAnsi="Times New Roman"/>
+                <w:b/>
+                <w:sz w:val="24"/>
+                <w:szCs w:val="24"/>
+              </w:rPr>
+              <w:t>8</w:t>
+            </w:r>
           </w:p>
         </w:tc>
       </w:tr>
@@ -2446,6 +2203,8 @@
               <w:rPr>
                 <w:rFonts w:ascii="Times New Roman" w:hAnsi="Times New Roman"/>
                 <w:b/>
+                <w:sz w:val="24"/>
+                <w:szCs w:val="24"/>
               </w:rPr>
             </w:pPr>
           </w:p>
@@ -2454,11 +2213,59 @@
           <w:tcPr>
             <w:tcW w:w="6736" w:type="dxa"/>
           </w:tcPr>
+          <w:tbl>
+            <w:tblPr>
+              <w:tblW w:w="0" w:type="auto"/>
+              <w:tblCellSpacing w:w="15" w:type="dxa"/>
+              <w:tblCellMar>
+                <w:top w:w="15" w:type="dxa"/>
+                <w:left w:w="15" w:type="dxa"/>
+                <w:bottom w:w="15" w:type="dxa"/>
+                <w:right w:w="15" w:type="dxa"/>
+              </w:tblCellMar>
+              <w:tblLook w:val="04A0" w:firstRow="1" w:lastRow="0" w:firstColumn="1" w:lastColumn="0" w:noHBand="0" w:noVBand="1"/>
+            </w:tblPr>
+            <w:tblGrid>
+              <w:gridCol w:w="4230"/>
+            </w:tblGrid>
+            <w:tr>
+              <w:trPr>
+                <w:tblCellSpacing w:w="15" w:type="dxa"/>
+              </w:trPr>
+              <w:tc>
+                <w:tcPr>
+                  <w:tcW w:w="0" w:type="auto"/>
+                  <w:vAlign w:val="center"/>
+                  <w:hideMark/>
+                </w:tcPr>
+                <w:p>
+                  <w:pPr>
+                    <w:spacing w:after="0" w:line="240" w:lineRule="auto"/>
+                    <w:rPr>
+                      <w:rFonts w:ascii="Times New Roman" w:hAnsi="Times New Roman"/>
+                      <w:sz w:val="24"/>
+                      <w:szCs w:val="24"/>
+                    </w:rPr>
+                  </w:pPr>
+                  <w:r>
+                    <w:rPr>
+                      <w:rFonts w:ascii="Times New Roman" w:hAnsi="Times New Roman"/>
+                      <w:sz w:val="24"/>
+                      <w:szCs w:val="24"/>
+                    </w:rPr>
+                    <w:t>Snapshot of Single-Hand Bicep Curl Mode</w:t>
+                  </w:r>
+                </w:p>
+              </w:tc>
+            </w:tr>
+          </w:tbl>
           <w:p>
             <w:pPr>
               <w:spacing w:after="120"/>
               <w:rPr>
                 <w:rFonts w:ascii="Times New Roman" w:hAnsi="Times New Roman"/>
+                <w:sz w:val="24"/>
+                <w:szCs w:val="24"/>
               </w:rPr>
             </w:pPr>
           </w:p>
@@ -2475,8 +2282,19 @@
               <w:rPr>
                 <w:rFonts w:ascii="Times New Roman" w:hAnsi="Times New Roman"/>
                 <w:b/>
+                <w:sz w:val="24"/>
+                <w:szCs w:val="24"/>
               </w:rPr>
             </w:pPr>
+            <w:r>
+              <w:rPr>
+                <w:rFonts w:ascii="Times New Roman" w:hAnsi="Times New Roman"/>
+                <w:b/>
+                <w:sz w:val="24"/>
+                <w:szCs w:val="24"/>
+              </w:rPr>
+              <w:t>11</w:t>
+            </w:r>
           </w:p>
         </w:tc>
       </w:tr>
@@ -2503,6 +2321,8 @@
               <w:rPr>
                 <w:rFonts w:ascii="Times New Roman" w:hAnsi="Times New Roman"/>
                 <w:b/>
+                <w:sz w:val="24"/>
+                <w:szCs w:val="24"/>
               </w:rPr>
             </w:pPr>
           </w:p>
@@ -2511,6 +2331,51 @@
           <w:tcPr>
             <w:tcW w:w="6736" w:type="dxa"/>
           </w:tcPr>
+          <w:tbl>
+            <w:tblPr>
+              <w:tblW w:w="0" w:type="auto"/>
+              <w:tblCellSpacing w:w="15" w:type="dxa"/>
+              <w:tblCellMar>
+                <w:top w:w="15" w:type="dxa"/>
+                <w:left w:w="15" w:type="dxa"/>
+                <w:bottom w:w="15" w:type="dxa"/>
+                <w:right w:w="15" w:type="dxa"/>
+              </w:tblCellMar>
+              <w:tblLook w:val="04A0" w:firstRow="1" w:lastRow="0" w:firstColumn="1" w:lastColumn="0" w:noHBand="0" w:noVBand="1"/>
+            </w:tblPr>
+            <w:tblGrid>
+              <w:gridCol w:w="4323"/>
+            </w:tblGrid>
+            <w:tr>
+              <w:trPr>
+                <w:tblCellSpacing w:w="15" w:type="dxa"/>
+              </w:trPr>
+              <w:tc>
+                <w:tcPr>
+                  <w:tcW w:w="0" w:type="auto"/>
+                  <w:vAlign w:val="center"/>
+                  <w:hideMark/>
+                </w:tcPr>
+                <w:p>
+                  <w:pPr>
+                    <w:rPr>
+                      <w:rFonts w:ascii="Times New Roman" w:hAnsi="Times New Roman"/>
+                      <w:sz w:val="24"/>
+                      <w:szCs w:val="24"/>
+                    </w:rPr>
+                  </w:pPr>
+                  <w:r>
+                    <w:rPr>
+                      <w:rFonts w:ascii="Times New Roman" w:hAnsi="Times New Roman"/>
+                      <w:sz w:val="24"/>
+                      <w:szCs w:val="24"/>
+                    </w:rPr>
+                    <w:t>Snapshot of Double-Hand Bicep Curl Mode</w:t>
+                  </w:r>
+                </w:p>
+              </w:tc>
+            </w:tr>
+          </w:tbl>
           <w:p>
             <w:pPr>
               <w:autoSpaceDE w:val="0"/>
@@ -2519,6 +2384,8 @@
               <w:spacing w:after="120"/>
               <w:rPr>
                 <w:rFonts w:ascii="Times New Roman" w:hAnsi="Times New Roman"/>
+                <w:sz w:val="24"/>
+                <w:szCs w:val="24"/>
               </w:rPr>
             </w:pPr>
           </w:p>
@@ -2538,8 +2405,19 @@
               <w:rPr>
                 <w:rFonts w:ascii="Times New Roman" w:hAnsi="Times New Roman"/>
                 <w:b/>
+                <w:sz w:val="24"/>
+                <w:szCs w:val="24"/>
               </w:rPr>
             </w:pPr>
+            <w:r>
+              <w:rPr>
+                <w:rFonts w:ascii="Times New Roman" w:hAnsi="Times New Roman"/>
+                <w:b/>
+                <w:sz w:val="24"/>
+                <w:szCs w:val="24"/>
+              </w:rPr>
+              <w:t>12</w:t>
+            </w:r>
           </w:p>
         </w:tc>
       </w:tr>
@@ -2566,6 +2444,8 @@
               <w:rPr>
                 <w:rFonts w:ascii="Times New Roman" w:hAnsi="Times New Roman"/>
                 <w:b/>
+                <w:sz w:val="24"/>
+                <w:szCs w:val="24"/>
               </w:rPr>
             </w:pPr>
           </w:p>
@@ -2574,6 +2454,51 @@
           <w:tcPr>
             <w:tcW w:w="6736" w:type="dxa"/>
           </w:tcPr>
+          <w:tbl>
+            <w:tblPr>
+              <w:tblW w:w="0" w:type="auto"/>
+              <w:tblCellSpacing w:w="15" w:type="dxa"/>
+              <w:tblCellMar>
+                <w:top w:w="15" w:type="dxa"/>
+                <w:left w:w="15" w:type="dxa"/>
+                <w:bottom w:w="15" w:type="dxa"/>
+                <w:right w:w="15" w:type="dxa"/>
+              </w:tblCellMar>
+              <w:tblLook w:val="04A0" w:firstRow="1" w:lastRow="0" w:firstColumn="1" w:lastColumn="0" w:noHBand="0" w:noVBand="1"/>
+            </w:tblPr>
+            <w:tblGrid>
+              <w:gridCol w:w="5163"/>
+            </w:tblGrid>
+            <w:tr>
+              <w:trPr>
+                <w:tblCellSpacing w:w="15" w:type="dxa"/>
+              </w:trPr>
+              <w:tc>
+                <w:tcPr>
+                  <w:tcW w:w="0" w:type="auto"/>
+                  <w:vAlign w:val="center"/>
+                  <w:hideMark/>
+                </w:tcPr>
+                <w:p>
+                  <w:pPr>
+                    <w:rPr>
+                      <w:rFonts w:ascii="Times New Roman" w:hAnsi="Times New Roman"/>
+                      <w:sz w:val="24"/>
+                      <w:szCs w:val="24"/>
+                    </w:rPr>
+                  </w:pPr>
+                  <w:r>
+                    <w:rPr>
+                      <w:rFonts w:ascii="Times New Roman" w:hAnsi="Times New Roman"/>
+                      <w:sz w:val="24"/>
+                      <w:szCs w:val="24"/>
+                    </w:rPr>
+                    <w:t>Annotated Image with Key points and their Meaning</w:t>
+                  </w:r>
+                </w:p>
+              </w:tc>
+            </w:tr>
+          </w:tbl>
           <w:p>
             <w:pPr>
               <w:autoSpaceDE w:val="0"/>
@@ -2583,6 +2508,8 @@
               <w:jc w:val="both"/>
               <w:rPr>
                 <w:rFonts w:ascii="Times New Roman" w:hAnsi="Times New Roman"/>
+                <w:sz w:val="24"/>
+                <w:szCs w:val="24"/>
               </w:rPr>
             </w:pPr>
           </w:p>
@@ -2602,309 +2529,19 @@
               <w:rPr>
                 <w:rFonts w:ascii="Times New Roman" w:hAnsi="Times New Roman"/>
                 <w:b/>
+                <w:sz w:val="24"/>
+                <w:szCs w:val="24"/>
               </w:rPr>
             </w:pPr>
-          </w:p>
-        </w:tc>
-      </w:tr>
-      <w:tr>
-        <w:trPr>
-          <w:jc w:val="center"/>
-        </w:trPr>
-        <w:tc>
-          <w:tcPr>
-            <w:tcW w:w="1306" w:type="dxa"/>
-            <w:vAlign w:val="center"/>
-          </w:tcPr>
-          <w:p>
-            <w:pPr>
-              <w:numPr>
-                <w:ilvl w:val="0"/>
-                <w:numId w:val="4"/>
-              </w:numPr>
-              <w:autoSpaceDE w:val="0"/>
-              <w:autoSpaceDN w:val="0"/>
-              <w:adjustRightInd w:val="0"/>
-              <w:spacing w:after="120" w:line="240" w:lineRule="auto"/>
-              <w:jc w:val="center"/>
+            <w:r>
               <w:rPr>
                 <w:rFonts w:ascii="Times New Roman" w:hAnsi="Times New Roman"/>
                 <w:b/>
-              </w:rPr>
-            </w:pPr>
-          </w:p>
-        </w:tc>
-        <w:tc>
-          <w:tcPr>
-            <w:tcW w:w="6736" w:type="dxa"/>
-          </w:tcPr>
-          <w:p>
-            <w:pPr>
-              <w:autoSpaceDE w:val="0"/>
-              <w:autoSpaceDN w:val="0"/>
-              <w:adjustRightInd w:val="0"/>
-              <w:spacing w:after="120"/>
-              <w:jc w:val="both"/>
-              <w:rPr>
-                <w:rFonts w:ascii="Times New Roman" w:hAnsi="Times New Roman"/>
-              </w:rPr>
-            </w:pPr>
-          </w:p>
-        </w:tc>
-        <w:tc>
-          <w:tcPr>
-            <w:tcW w:w="885" w:type="dxa"/>
-            <w:vAlign w:val="center"/>
-          </w:tcPr>
-          <w:p>
-            <w:pPr>
-              <w:autoSpaceDE w:val="0"/>
-              <w:autoSpaceDN w:val="0"/>
-              <w:adjustRightInd w:val="0"/>
-              <w:spacing w:after="120"/>
-              <w:jc w:val="center"/>
-              <w:rPr>
-                <w:rFonts w:ascii="Times New Roman" w:hAnsi="Times New Roman"/>
-                <w:b/>
-              </w:rPr>
-            </w:pPr>
-          </w:p>
-        </w:tc>
-      </w:tr>
-      <w:tr>
-        <w:trPr>
-          <w:jc w:val="center"/>
-        </w:trPr>
-        <w:tc>
-          <w:tcPr>
-            <w:tcW w:w="1306" w:type="dxa"/>
-            <w:vAlign w:val="center"/>
-          </w:tcPr>
-          <w:p>
-            <w:pPr>
-              <w:numPr>
-                <w:ilvl w:val="0"/>
-                <w:numId w:val="4"/>
-              </w:numPr>
-              <w:spacing w:after="120" w:line="240" w:lineRule="auto"/>
-              <w:jc w:val="center"/>
-              <w:rPr>
-                <w:rFonts w:ascii="Times New Roman" w:hAnsi="Times New Roman"/>
-                <w:b/>
-              </w:rPr>
-            </w:pPr>
-          </w:p>
-        </w:tc>
-        <w:tc>
-          <w:tcPr>
-            <w:tcW w:w="6736" w:type="dxa"/>
-          </w:tcPr>
-          <w:p>
-            <w:pPr>
-              <w:spacing w:after="120"/>
-              <w:rPr>
-                <w:rFonts w:ascii="Times New Roman" w:hAnsi="Times New Roman"/>
-              </w:rPr>
-            </w:pPr>
-          </w:p>
-        </w:tc>
-        <w:tc>
-          <w:tcPr>
-            <w:tcW w:w="885" w:type="dxa"/>
-            <w:vAlign w:val="center"/>
-          </w:tcPr>
-          <w:p>
-            <w:pPr>
-              <w:spacing w:after="120"/>
-              <w:jc w:val="center"/>
-              <w:rPr>
-                <w:rFonts w:ascii="Times New Roman" w:hAnsi="Times New Roman"/>
-                <w:b/>
-              </w:rPr>
-            </w:pPr>
-          </w:p>
-        </w:tc>
-      </w:tr>
-      <w:tr>
-        <w:trPr>
-          <w:jc w:val="center"/>
-        </w:trPr>
-        <w:tc>
-          <w:tcPr>
-            <w:tcW w:w="1306" w:type="dxa"/>
-            <w:vAlign w:val="center"/>
-          </w:tcPr>
-          <w:p>
-            <w:pPr>
-              <w:numPr>
-                <w:ilvl w:val="0"/>
-                <w:numId w:val="4"/>
-              </w:numPr>
-              <w:spacing w:after="120" w:line="240" w:lineRule="auto"/>
-              <w:jc w:val="center"/>
-              <w:rPr>
-                <w:rFonts w:ascii="Times New Roman" w:hAnsi="Times New Roman"/>
-                <w:b/>
-              </w:rPr>
-            </w:pPr>
-          </w:p>
-        </w:tc>
-        <w:tc>
-          <w:tcPr>
-            <w:tcW w:w="6736" w:type="dxa"/>
-          </w:tcPr>
-          <w:p>
-            <w:pPr>
-              <w:spacing w:after="120"/>
-              <w:rPr>
-                <w:rFonts w:ascii="Times New Roman" w:hAnsi="Times New Roman"/>
-              </w:rPr>
-            </w:pPr>
-          </w:p>
-        </w:tc>
-        <w:tc>
-          <w:tcPr>
-            <w:tcW w:w="885" w:type="dxa"/>
-            <w:vAlign w:val="center"/>
-          </w:tcPr>
-          <w:p>
-            <w:pPr>
-              <w:spacing w:after="120"/>
-              <w:jc w:val="center"/>
-              <w:rPr>
-                <w:rFonts w:ascii="Times New Roman" w:hAnsi="Times New Roman"/>
-                <w:b/>
-              </w:rPr>
-            </w:pPr>
-          </w:p>
-        </w:tc>
-      </w:tr>
-      <w:tr>
-        <w:trPr>
-          <w:trHeight w:val="109"/>
-          <w:jc w:val="center"/>
-        </w:trPr>
-        <w:tc>
-          <w:tcPr>
-            <w:tcW w:w="1306" w:type="dxa"/>
-            <w:vAlign w:val="center"/>
-          </w:tcPr>
-          <w:p>
-            <w:pPr>
-              <w:numPr>
-                <w:ilvl w:val="0"/>
-                <w:numId w:val="4"/>
-              </w:numPr>
-              <w:autoSpaceDE w:val="0"/>
-              <w:autoSpaceDN w:val="0"/>
-              <w:adjustRightInd w:val="0"/>
-              <w:spacing w:after="120" w:line="240" w:lineRule="auto"/>
-              <w:jc w:val="center"/>
-              <w:rPr>
-                <w:rFonts w:ascii="Times New Roman" w:hAnsi="Times New Roman"/>
-                <w:b/>
-              </w:rPr>
-            </w:pPr>
-          </w:p>
-        </w:tc>
-        <w:tc>
-          <w:tcPr>
-            <w:tcW w:w="6736" w:type="dxa"/>
-          </w:tcPr>
-          <w:p>
-            <w:pPr>
-              <w:autoSpaceDE w:val="0"/>
-              <w:autoSpaceDN w:val="0"/>
-              <w:adjustRightInd w:val="0"/>
-              <w:spacing w:after="120"/>
-              <w:jc w:val="both"/>
-              <w:rPr>
-                <w:rFonts w:ascii="Times New Roman" w:hAnsi="Times New Roman"/>
-              </w:rPr>
-            </w:pPr>
-          </w:p>
-        </w:tc>
-        <w:tc>
-          <w:tcPr>
-            <w:tcW w:w="885" w:type="dxa"/>
-            <w:vAlign w:val="center"/>
-          </w:tcPr>
-          <w:p>
-            <w:pPr>
-              <w:autoSpaceDE w:val="0"/>
-              <w:autoSpaceDN w:val="0"/>
-              <w:adjustRightInd w:val="0"/>
-              <w:spacing w:after="120"/>
-              <w:jc w:val="center"/>
-              <w:rPr>
-                <w:rFonts w:ascii="Times New Roman" w:hAnsi="Times New Roman"/>
-                <w:b/>
-              </w:rPr>
-            </w:pPr>
-          </w:p>
-        </w:tc>
-      </w:tr>
-      <w:tr>
-        <w:trPr>
-          <w:jc w:val="center"/>
-        </w:trPr>
-        <w:tc>
-          <w:tcPr>
-            <w:tcW w:w="1306" w:type="dxa"/>
-            <w:vAlign w:val="center"/>
-          </w:tcPr>
-          <w:p>
-            <w:pPr>
-              <w:numPr>
-                <w:ilvl w:val="0"/>
-                <w:numId w:val="4"/>
-              </w:numPr>
-              <w:autoSpaceDE w:val="0"/>
-              <w:autoSpaceDN w:val="0"/>
-              <w:adjustRightInd w:val="0"/>
-              <w:spacing w:after="120" w:line="240" w:lineRule="auto"/>
-              <w:jc w:val="center"/>
-              <w:rPr>
-                <w:rFonts w:ascii="Times New Roman" w:hAnsi="Times New Roman"/>
-                <w:b/>
-              </w:rPr>
-            </w:pPr>
-          </w:p>
-        </w:tc>
-        <w:tc>
-          <w:tcPr>
-            <w:tcW w:w="6736" w:type="dxa"/>
-          </w:tcPr>
-          <w:p>
-            <w:pPr>
-              <w:autoSpaceDE w:val="0"/>
-              <w:autoSpaceDN w:val="0"/>
-              <w:adjustRightInd w:val="0"/>
-              <w:spacing w:after="120"/>
-              <w:jc w:val="both"/>
-              <w:rPr>
-                <w:rFonts w:ascii="Times New Roman" w:hAnsi="Times New Roman"/>
-              </w:rPr>
-            </w:pPr>
-          </w:p>
-        </w:tc>
-        <w:tc>
-          <w:tcPr>
-            <w:tcW w:w="885" w:type="dxa"/>
-            <w:vAlign w:val="center"/>
-          </w:tcPr>
-          <w:p>
-            <w:pPr>
-              <w:autoSpaceDE w:val="0"/>
-              <w:autoSpaceDN w:val="0"/>
-              <w:adjustRightInd w:val="0"/>
-              <w:spacing w:after="120"/>
-              <w:jc w:val="center"/>
-              <w:rPr>
-                <w:rFonts w:ascii="Times New Roman" w:hAnsi="Times New Roman"/>
-                <w:b/>
-              </w:rPr>
-            </w:pPr>
+                <w:sz w:val="24"/>
+                <w:szCs w:val="24"/>
+              </w:rPr>
+              <w:t>13</w:t>
+            </w:r>
           </w:p>
         </w:tc>
       </w:tr>
@@ -3109,6 +2746,50 @@
     </w:p>
     <w:p>
       <w:pPr>
+        <w:spacing w:after="120"/>
+        <w:jc w:val="both"/>
+        <w:rPr>
+          <w:rFonts w:ascii="Times New Roman" w:hAnsi="Times New Roman"/>
+          <w:sz w:val="28"/>
+          <w:szCs w:val="28"/>
+        </w:rPr>
+      </w:pPr>
+    </w:p>
+    <w:p>
+      <w:pPr>
+        <w:spacing w:after="120"/>
+        <w:jc w:val="both"/>
+        <w:rPr>
+          <w:rFonts w:ascii="Times New Roman" w:hAnsi="Times New Roman"/>
+          <w:sz w:val="28"/>
+          <w:szCs w:val="28"/>
+        </w:rPr>
+      </w:pPr>
+    </w:p>
+    <w:p>
+      <w:pPr>
+        <w:spacing w:after="120"/>
+        <w:jc w:val="both"/>
+        <w:rPr>
+          <w:rFonts w:ascii="Times New Roman" w:hAnsi="Times New Roman"/>
+          <w:sz w:val="28"/>
+          <w:szCs w:val="28"/>
+        </w:rPr>
+      </w:pPr>
+    </w:p>
+    <w:p>
+      <w:pPr>
+        <w:spacing w:after="120"/>
+        <w:jc w:val="both"/>
+        <w:rPr>
+          <w:rFonts w:ascii="Times New Roman" w:hAnsi="Times New Roman"/>
+          <w:sz w:val="28"/>
+          <w:szCs w:val="28"/>
+        </w:rPr>
+      </w:pPr>
+    </w:p>
+    <w:p>
+      <w:pPr>
         <w:pBdr>
           <w:bottom w:val="single" w:sz="4" w:space="0" w:color="auto"/>
         </w:pBdr>
@@ -3130,6 +2811,7 @@
           <w:sz w:val="28"/>
           <w:szCs w:val="28"/>
         </w:rPr>
+        <w:lastRenderedPageBreak/>
         <w:t>LIST OF TABLES</w:t>
       </w:r>
     </w:p>
@@ -3245,7 +2927,6 @@
         <w:tc>
           <w:tcPr>
             <w:tcW w:w="1306" w:type="dxa"/>
-            <w:vAlign w:val="center"/>
           </w:tcPr>
           <w:p>
             <w:pPr>
@@ -3258,12 +2939,42 @@
                 <w:szCs w:val="24"/>
               </w:rPr>
             </w:pPr>
+            <w:r>
+              <w:rPr>
+                <w:rFonts w:ascii="Times New Roman" w:hAnsi="Times New Roman"/>
+                <w:sz w:val="24"/>
+                <w:szCs w:val="24"/>
+              </w:rPr>
+              <w:t>Table 1</w:t>
+            </w:r>
           </w:p>
         </w:tc>
         <w:tc>
           <w:tcPr>
             <w:tcW w:w="6736" w:type="dxa"/>
-            <w:vAlign w:val="center"/>
+          </w:tcPr>
+          <w:p>
+            <w:pPr>
+              <w:spacing w:after="120"/>
+              <w:rPr>
+                <w:rFonts w:ascii="Times New Roman" w:hAnsi="Times New Roman"/>
+                <w:sz w:val="24"/>
+                <w:szCs w:val="24"/>
+              </w:rPr>
+            </w:pPr>
+            <w:r>
+              <w:rPr>
+                <w:rFonts w:ascii="Times New Roman" w:hAnsi="Times New Roman"/>
+                <w:sz w:val="24"/>
+                <w:szCs w:val="24"/>
+              </w:rPr>
+              <w:t>Objectives of the Project</w:t>
+            </w:r>
+          </w:p>
+        </w:tc>
+        <w:tc>
+          <w:tcPr>
+            <w:tcW w:w="885" w:type="dxa"/>
           </w:tcPr>
           <w:p>
             <w:pPr>
@@ -3271,28 +2982,20 @@
               <w:jc w:val="center"/>
               <w:rPr>
                 <w:rFonts w:ascii="Times New Roman" w:hAnsi="Times New Roman"/>
+                <w:b/>
                 <w:sz w:val="24"/>
                 <w:szCs w:val="24"/>
               </w:rPr>
             </w:pPr>
-          </w:p>
-        </w:tc>
-        <w:tc>
-          <w:tcPr>
-            <w:tcW w:w="885" w:type="dxa"/>
-            <w:vAlign w:val="center"/>
-          </w:tcPr>
-          <w:p>
-            <w:pPr>
-              <w:spacing w:after="120"/>
-              <w:jc w:val="center"/>
+            <w:r>
               <w:rPr>
                 <w:rFonts w:ascii="Times New Roman" w:hAnsi="Times New Roman"/>
                 <w:b/>
                 <w:sz w:val="24"/>
                 <w:szCs w:val="24"/>
               </w:rPr>
-            </w:pPr>
+              <w:t>3</w:t>
+            </w:r>
           </w:p>
         </w:tc>
       </w:tr>
@@ -3303,7 +3006,6 @@
         <w:tc>
           <w:tcPr>
             <w:tcW w:w="1306" w:type="dxa"/>
-            <w:vAlign w:val="center"/>
           </w:tcPr>
           <w:p>
             <w:pPr>
@@ -3316,12 +3018,42 @@
                 <w:szCs w:val="24"/>
               </w:rPr>
             </w:pPr>
+            <w:r>
+              <w:rPr>
+                <w:rFonts w:ascii="Times New Roman" w:hAnsi="Times New Roman"/>
+                <w:sz w:val="24"/>
+                <w:szCs w:val="24"/>
+              </w:rPr>
+              <w:t>Table 2</w:t>
+            </w:r>
           </w:p>
         </w:tc>
         <w:tc>
           <w:tcPr>
             <w:tcW w:w="6736" w:type="dxa"/>
-            <w:vAlign w:val="center"/>
+          </w:tcPr>
+          <w:p>
+            <w:pPr>
+              <w:spacing w:after="120"/>
+              <w:rPr>
+                <w:rFonts w:ascii="Times New Roman" w:hAnsi="Times New Roman"/>
+                <w:sz w:val="24"/>
+                <w:szCs w:val="24"/>
+              </w:rPr>
+            </w:pPr>
+            <w:r>
+              <w:rPr>
+                <w:rFonts w:ascii="Times New Roman" w:hAnsi="Times New Roman"/>
+                <w:sz w:val="24"/>
+                <w:szCs w:val="24"/>
+              </w:rPr>
+              <w:t>Scope and Limitations of the Project</w:t>
+            </w:r>
+          </w:p>
+        </w:tc>
+        <w:tc>
+          <w:tcPr>
+            <w:tcW w:w="885" w:type="dxa"/>
           </w:tcPr>
           <w:p>
             <w:pPr>
@@ -3329,28 +3061,20 @@
               <w:jc w:val="center"/>
               <w:rPr>
                 <w:rFonts w:ascii="Times New Roman" w:hAnsi="Times New Roman"/>
+                <w:b/>
                 <w:sz w:val="24"/>
                 <w:szCs w:val="24"/>
               </w:rPr>
             </w:pPr>
-          </w:p>
-        </w:tc>
-        <w:tc>
-          <w:tcPr>
-            <w:tcW w:w="885" w:type="dxa"/>
-            <w:vAlign w:val="center"/>
-          </w:tcPr>
-          <w:p>
-            <w:pPr>
-              <w:spacing w:after="120"/>
-              <w:jc w:val="center"/>
+            <w:r>
               <w:rPr>
                 <w:rFonts w:ascii="Times New Roman" w:hAnsi="Times New Roman"/>
                 <w:b/>
                 <w:sz w:val="24"/>
                 <w:szCs w:val="24"/>
               </w:rPr>
-            </w:pPr>
+              <w:t>4</w:t>
+            </w:r>
           </w:p>
         </w:tc>
       </w:tr>
@@ -3361,7 +3085,6 @@
         <w:tc>
           <w:tcPr>
             <w:tcW w:w="1306" w:type="dxa"/>
-            <w:vAlign w:val="center"/>
           </w:tcPr>
           <w:p>
             <w:pPr>
@@ -3377,12 +3100,45 @@
                 <w:szCs w:val="24"/>
               </w:rPr>
             </w:pPr>
+            <w:r>
+              <w:rPr>
+                <w:rFonts w:ascii="Times New Roman" w:hAnsi="Times New Roman"/>
+                <w:sz w:val="24"/>
+                <w:szCs w:val="24"/>
+              </w:rPr>
+              <w:t>Table 3</w:t>
+            </w:r>
           </w:p>
         </w:tc>
         <w:tc>
           <w:tcPr>
             <w:tcW w:w="6736" w:type="dxa"/>
-            <w:vAlign w:val="center"/>
+          </w:tcPr>
+          <w:p>
+            <w:pPr>
+              <w:autoSpaceDE w:val="0"/>
+              <w:autoSpaceDN w:val="0"/>
+              <w:adjustRightInd w:val="0"/>
+              <w:spacing w:after="120"/>
+              <w:rPr>
+                <w:rFonts w:ascii="Times New Roman" w:hAnsi="Times New Roman"/>
+                <w:sz w:val="24"/>
+                <w:szCs w:val="24"/>
+              </w:rPr>
+            </w:pPr>
+            <w:r>
+              <w:rPr>
+                <w:rFonts w:ascii="Times New Roman" w:hAnsi="Times New Roman"/>
+                <w:sz w:val="24"/>
+                <w:szCs w:val="24"/>
+              </w:rPr>
+              <w:t>Hardware Requirements for the Project</w:t>
+            </w:r>
+          </w:p>
+        </w:tc>
+        <w:tc>
+          <w:tcPr>
+            <w:tcW w:w="885" w:type="dxa"/>
           </w:tcPr>
           <w:p>
             <w:pPr>
@@ -3393,31 +3149,20 @@
               <w:jc w:val="center"/>
               <w:rPr>
                 <w:rFonts w:ascii="Times New Roman" w:hAnsi="Times New Roman"/>
+                <w:b/>
                 <w:sz w:val="24"/>
                 <w:szCs w:val="24"/>
               </w:rPr>
             </w:pPr>
-          </w:p>
-        </w:tc>
-        <w:tc>
-          <w:tcPr>
-            <w:tcW w:w="885" w:type="dxa"/>
-            <w:vAlign w:val="center"/>
-          </w:tcPr>
-          <w:p>
-            <w:pPr>
-              <w:autoSpaceDE w:val="0"/>
-              <w:autoSpaceDN w:val="0"/>
-              <w:adjustRightInd w:val="0"/>
-              <w:spacing w:after="120"/>
-              <w:jc w:val="center"/>
+            <w:r>
               <w:rPr>
                 <w:rFonts w:ascii="Times New Roman" w:hAnsi="Times New Roman"/>
                 <w:b/>
                 <w:sz w:val="24"/>
                 <w:szCs w:val="24"/>
               </w:rPr>
-            </w:pPr>
+              <w:t>10</w:t>
+            </w:r>
           </w:p>
         </w:tc>
       </w:tr>
@@ -3428,7 +3173,6 @@
         <w:tc>
           <w:tcPr>
             <w:tcW w:w="1306" w:type="dxa"/>
-            <w:vAlign w:val="center"/>
           </w:tcPr>
           <w:p>
             <w:pPr>
@@ -3444,12 +3188,45 @@
                 <w:szCs w:val="24"/>
               </w:rPr>
             </w:pPr>
+            <w:r>
+              <w:rPr>
+                <w:rFonts w:ascii="Times New Roman" w:hAnsi="Times New Roman"/>
+                <w:sz w:val="24"/>
+                <w:szCs w:val="24"/>
+              </w:rPr>
+              <w:t>Table 4</w:t>
+            </w:r>
           </w:p>
         </w:tc>
         <w:tc>
           <w:tcPr>
             <w:tcW w:w="6736" w:type="dxa"/>
-            <w:vAlign w:val="center"/>
+          </w:tcPr>
+          <w:p>
+            <w:pPr>
+              <w:autoSpaceDE w:val="0"/>
+              <w:autoSpaceDN w:val="0"/>
+              <w:adjustRightInd w:val="0"/>
+              <w:spacing w:after="120"/>
+              <w:rPr>
+                <w:rFonts w:ascii="Times New Roman" w:hAnsi="Times New Roman"/>
+                <w:sz w:val="24"/>
+                <w:szCs w:val="24"/>
+              </w:rPr>
+            </w:pPr>
+            <w:r>
+              <w:rPr>
+                <w:rFonts w:ascii="Times New Roman" w:hAnsi="Times New Roman"/>
+                <w:sz w:val="24"/>
+                <w:szCs w:val="24"/>
+              </w:rPr>
+              <w:t>Software Requirements for the Project</w:t>
+            </w:r>
+          </w:p>
+        </w:tc>
+        <w:tc>
+          <w:tcPr>
+            <w:tcW w:w="885" w:type="dxa"/>
           </w:tcPr>
           <w:p>
             <w:pPr>
@@ -3460,31 +3237,20 @@
               <w:jc w:val="center"/>
               <w:rPr>
                 <w:rFonts w:ascii="Times New Roman" w:hAnsi="Times New Roman"/>
+                <w:b/>
                 <w:sz w:val="24"/>
                 <w:szCs w:val="24"/>
               </w:rPr>
             </w:pPr>
-          </w:p>
-        </w:tc>
-        <w:tc>
-          <w:tcPr>
-            <w:tcW w:w="885" w:type="dxa"/>
-            <w:vAlign w:val="center"/>
-          </w:tcPr>
-          <w:p>
-            <w:pPr>
-              <w:autoSpaceDE w:val="0"/>
-              <w:autoSpaceDN w:val="0"/>
-              <w:adjustRightInd w:val="0"/>
-              <w:spacing w:after="120"/>
-              <w:jc w:val="center"/>
+            <w:r>
               <w:rPr>
                 <w:rFonts w:ascii="Times New Roman" w:hAnsi="Times New Roman"/>
                 <w:b/>
                 <w:sz w:val="24"/>
                 <w:szCs w:val="24"/>
               </w:rPr>
-            </w:pPr>
+              <w:t>10</w:t>
+            </w:r>
           </w:p>
         </w:tc>
       </w:tr>
@@ -3495,7 +3261,6 @@
         <w:tc>
           <w:tcPr>
             <w:tcW w:w="1306" w:type="dxa"/>
-            <w:vAlign w:val="center"/>
           </w:tcPr>
           <w:p>
             <w:pPr>
@@ -3511,12 +3276,45 @@
                 <w:szCs w:val="24"/>
               </w:rPr>
             </w:pPr>
+            <w:r>
+              <w:rPr>
+                <w:rFonts w:ascii="Times New Roman" w:hAnsi="Times New Roman"/>
+                <w:sz w:val="24"/>
+                <w:szCs w:val="24"/>
+              </w:rPr>
+              <w:t>Table 5</w:t>
+            </w:r>
           </w:p>
         </w:tc>
         <w:tc>
           <w:tcPr>
             <w:tcW w:w="6736" w:type="dxa"/>
-            <w:vAlign w:val="center"/>
+          </w:tcPr>
+          <w:p>
+            <w:pPr>
+              <w:autoSpaceDE w:val="0"/>
+              <w:autoSpaceDN w:val="0"/>
+              <w:adjustRightInd w:val="0"/>
+              <w:spacing w:after="120"/>
+              <w:rPr>
+                <w:rFonts w:ascii="Times New Roman" w:hAnsi="Times New Roman"/>
+                <w:sz w:val="24"/>
+                <w:szCs w:val="24"/>
+              </w:rPr>
+            </w:pPr>
+            <w:r>
+              <w:rPr>
+                <w:rFonts w:ascii="Times New Roman" w:hAnsi="Times New Roman"/>
+                <w:sz w:val="24"/>
+                <w:szCs w:val="24"/>
+              </w:rPr>
+              <w:t>Comparison Between Single and Double-Hand Modes</w:t>
+            </w:r>
+          </w:p>
+        </w:tc>
+        <w:tc>
+          <w:tcPr>
+            <w:tcW w:w="885" w:type="dxa"/>
           </w:tcPr>
           <w:p>
             <w:pPr>
@@ -3527,282 +3325,20 @@
               <w:jc w:val="center"/>
               <w:rPr>
                 <w:rFonts w:ascii="Times New Roman" w:hAnsi="Times New Roman"/>
+                <w:b/>
                 <w:sz w:val="24"/>
                 <w:szCs w:val="24"/>
               </w:rPr>
             </w:pPr>
-          </w:p>
-        </w:tc>
-        <w:tc>
-          <w:tcPr>
-            <w:tcW w:w="885" w:type="dxa"/>
-            <w:vAlign w:val="center"/>
-          </w:tcPr>
-          <w:p>
-            <w:pPr>
-              <w:autoSpaceDE w:val="0"/>
-              <w:autoSpaceDN w:val="0"/>
-              <w:adjustRightInd w:val="0"/>
-              <w:spacing w:after="120"/>
-              <w:jc w:val="center"/>
+            <w:r>
               <w:rPr>
                 <w:rFonts w:ascii="Times New Roman" w:hAnsi="Times New Roman"/>
                 <w:b/>
                 <w:sz w:val="24"/>
                 <w:szCs w:val="24"/>
               </w:rPr>
-            </w:pPr>
-          </w:p>
-        </w:tc>
-      </w:tr>
-      <w:tr>
-        <w:trPr>
-          <w:jc w:val="center"/>
-        </w:trPr>
-        <w:tc>
-          <w:tcPr>
-            <w:tcW w:w="1306" w:type="dxa"/>
-            <w:vAlign w:val="center"/>
-          </w:tcPr>
-          <w:p>
-            <w:pPr>
-              <w:spacing w:after="120" w:line="240" w:lineRule="auto"/>
-              <w:jc w:val="center"/>
-              <w:rPr>
-                <w:rFonts w:ascii="Times New Roman" w:hAnsi="Times New Roman"/>
-                <w:b/>
-                <w:sz w:val="24"/>
-                <w:szCs w:val="24"/>
-              </w:rPr>
-            </w:pPr>
-          </w:p>
-        </w:tc>
-        <w:tc>
-          <w:tcPr>
-            <w:tcW w:w="6736" w:type="dxa"/>
-            <w:vAlign w:val="center"/>
-          </w:tcPr>
-          <w:p>
-            <w:pPr>
-              <w:spacing w:after="120"/>
-              <w:jc w:val="center"/>
-              <w:rPr>
-                <w:rFonts w:ascii="Times New Roman" w:hAnsi="Times New Roman"/>
-                <w:sz w:val="24"/>
-                <w:szCs w:val="24"/>
-              </w:rPr>
-            </w:pPr>
-          </w:p>
-        </w:tc>
-        <w:tc>
-          <w:tcPr>
-            <w:tcW w:w="885" w:type="dxa"/>
-            <w:vAlign w:val="center"/>
-          </w:tcPr>
-          <w:p>
-            <w:pPr>
-              <w:spacing w:after="120"/>
-              <w:jc w:val="center"/>
-              <w:rPr>
-                <w:rFonts w:ascii="Times New Roman" w:hAnsi="Times New Roman"/>
-                <w:b/>
-                <w:sz w:val="24"/>
-                <w:szCs w:val="24"/>
-              </w:rPr>
-            </w:pPr>
-          </w:p>
-        </w:tc>
-      </w:tr>
-      <w:tr>
-        <w:trPr>
-          <w:jc w:val="center"/>
-        </w:trPr>
-        <w:tc>
-          <w:tcPr>
-            <w:tcW w:w="1306" w:type="dxa"/>
-            <w:vAlign w:val="center"/>
-          </w:tcPr>
-          <w:p>
-            <w:pPr>
-              <w:spacing w:after="120" w:line="240" w:lineRule="auto"/>
-              <w:jc w:val="center"/>
-              <w:rPr>
-                <w:rFonts w:ascii="Times New Roman" w:hAnsi="Times New Roman"/>
-                <w:b/>
-                <w:sz w:val="24"/>
-                <w:szCs w:val="24"/>
-              </w:rPr>
-            </w:pPr>
-          </w:p>
-        </w:tc>
-        <w:tc>
-          <w:tcPr>
-            <w:tcW w:w="6736" w:type="dxa"/>
-            <w:vAlign w:val="center"/>
-          </w:tcPr>
-          <w:p>
-            <w:pPr>
-              <w:spacing w:after="120"/>
-              <w:jc w:val="center"/>
-              <w:rPr>
-                <w:rFonts w:ascii="Times New Roman" w:hAnsi="Times New Roman"/>
-                <w:sz w:val="24"/>
-                <w:szCs w:val="24"/>
-              </w:rPr>
-            </w:pPr>
-          </w:p>
-        </w:tc>
-        <w:tc>
-          <w:tcPr>
-            <w:tcW w:w="885" w:type="dxa"/>
-            <w:vAlign w:val="center"/>
-          </w:tcPr>
-          <w:p>
-            <w:pPr>
-              <w:spacing w:after="120"/>
-              <w:jc w:val="center"/>
-              <w:rPr>
-                <w:rFonts w:ascii="Times New Roman" w:hAnsi="Times New Roman"/>
-                <w:b/>
-                <w:sz w:val="24"/>
-                <w:szCs w:val="24"/>
-              </w:rPr>
-            </w:pPr>
-          </w:p>
-        </w:tc>
-      </w:tr>
-      <w:tr>
-        <w:trPr>
-          <w:trHeight w:val="109"/>
-          <w:jc w:val="center"/>
-        </w:trPr>
-        <w:tc>
-          <w:tcPr>
-            <w:tcW w:w="1306" w:type="dxa"/>
-            <w:vAlign w:val="center"/>
-          </w:tcPr>
-          <w:p>
-            <w:pPr>
-              <w:autoSpaceDE w:val="0"/>
-              <w:autoSpaceDN w:val="0"/>
-              <w:adjustRightInd w:val="0"/>
-              <w:spacing w:after="120" w:line="240" w:lineRule="auto"/>
-              <w:jc w:val="center"/>
-              <w:rPr>
-                <w:rFonts w:ascii="Times New Roman" w:hAnsi="Times New Roman"/>
-                <w:b/>
-                <w:sz w:val="24"/>
-                <w:szCs w:val="24"/>
-              </w:rPr>
-            </w:pPr>
-          </w:p>
-        </w:tc>
-        <w:tc>
-          <w:tcPr>
-            <w:tcW w:w="6736" w:type="dxa"/>
-            <w:vAlign w:val="center"/>
-          </w:tcPr>
-          <w:p>
-            <w:pPr>
-              <w:autoSpaceDE w:val="0"/>
-              <w:autoSpaceDN w:val="0"/>
-              <w:adjustRightInd w:val="0"/>
-              <w:spacing w:after="120"/>
-              <w:jc w:val="center"/>
-              <w:rPr>
-                <w:rFonts w:ascii="Times New Roman" w:hAnsi="Times New Roman"/>
-                <w:sz w:val="24"/>
-                <w:szCs w:val="24"/>
-              </w:rPr>
-            </w:pPr>
-          </w:p>
-        </w:tc>
-        <w:tc>
-          <w:tcPr>
-            <w:tcW w:w="885" w:type="dxa"/>
-            <w:vAlign w:val="center"/>
-          </w:tcPr>
-          <w:p>
-            <w:pPr>
-              <w:autoSpaceDE w:val="0"/>
-              <w:autoSpaceDN w:val="0"/>
-              <w:adjustRightInd w:val="0"/>
-              <w:spacing w:after="120"/>
-              <w:jc w:val="center"/>
-              <w:rPr>
-                <w:rFonts w:ascii="Times New Roman" w:hAnsi="Times New Roman"/>
-                <w:b/>
-                <w:sz w:val="24"/>
-                <w:szCs w:val="24"/>
-              </w:rPr>
-            </w:pPr>
-          </w:p>
-        </w:tc>
-      </w:tr>
-      <w:tr>
-        <w:trPr>
-          <w:jc w:val="center"/>
-        </w:trPr>
-        <w:tc>
-          <w:tcPr>
-            <w:tcW w:w="1306" w:type="dxa"/>
-            <w:vAlign w:val="center"/>
-          </w:tcPr>
-          <w:p>
-            <w:pPr>
-              <w:autoSpaceDE w:val="0"/>
-              <w:autoSpaceDN w:val="0"/>
-              <w:adjustRightInd w:val="0"/>
-              <w:spacing w:after="120" w:line="240" w:lineRule="auto"/>
-              <w:jc w:val="center"/>
-              <w:rPr>
-                <w:rFonts w:ascii="Times New Roman" w:hAnsi="Times New Roman"/>
-                <w:b/>
-                <w:sz w:val="24"/>
-                <w:szCs w:val="24"/>
-              </w:rPr>
-            </w:pPr>
-          </w:p>
-        </w:tc>
-        <w:tc>
-          <w:tcPr>
-            <w:tcW w:w="6736" w:type="dxa"/>
-            <w:vAlign w:val="center"/>
-          </w:tcPr>
-          <w:p>
-            <w:pPr>
-              <w:autoSpaceDE w:val="0"/>
-              <w:autoSpaceDN w:val="0"/>
-              <w:adjustRightInd w:val="0"/>
-              <w:spacing w:after="120"/>
-              <w:jc w:val="center"/>
-              <w:rPr>
-                <w:rFonts w:ascii="Times New Roman" w:hAnsi="Times New Roman"/>
-                <w:sz w:val="24"/>
-                <w:szCs w:val="24"/>
-              </w:rPr>
-            </w:pPr>
-          </w:p>
-        </w:tc>
-        <w:tc>
-          <w:tcPr>
-            <w:tcW w:w="885" w:type="dxa"/>
-            <w:vAlign w:val="center"/>
-          </w:tcPr>
-          <w:p>
-            <w:pPr>
-              <w:autoSpaceDE w:val="0"/>
-              <w:autoSpaceDN w:val="0"/>
-              <w:adjustRightInd w:val="0"/>
-              <w:spacing w:after="120"/>
-              <w:jc w:val="center"/>
-              <w:rPr>
-                <w:rFonts w:ascii="Times New Roman" w:hAnsi="Times New Roman"/>
-                <w:b/>
-                <w:sz w:val="24"/>
-                <w:szCs w:val="24"/>
-              </w:rPr>
-            </w:pPr>
+              <w:t>13</w:t>
+            </w:r>
           </w:p>
         </w:tc>
       </w:tr>
@@ -4477,27 +4013,7 @@
           <w:szCs w:val="24"/>
           <w:lang w:val="en-IN" w:eastAsia="en-IN"/>
         </w:rPr>
-        <w:t xml:space="preserve">: Create an AI-based application capable of tracking and </w:t>
-      </w:r>
-      <w:proofErr w:type="spellStart"/>
-      <w:r>
-        <w:rPr>
-          <w:rFonts w:ascii="Times New Roman" w:eastAsia="Times New Roman" w:hAnsi="Times New Roman"/>
-          <w:sz w:val="24"/>
-          <w:szCs w:val="24"/>
-          <w:lang w:val="en-IN" w:eastAsia="en-IN"/>
-        </w:rPr>
-        <w:t>analyzing</w:t>
-      </w:r>
-      <w:proofErr w:type="spellEnd"/>
-      <w:r>
-        <w:rPr>
-          <w:rFonts w:ascii="Times New Roman" w:eastAsia="Times New Roman" w:hAnsi="Times New Roman"/>
-          <w:sz w:val="24"/>
-          <w:szCs w:val="24"/>
-          <w:lang w:val="en-IN" w:eastAsia="en-IN"/>
-        </w:rPr>
-        <w:t xml:space="preserve"> bicep curl exercises in real-time using a standard webcam.</w:t>
+        <w:t>: Create an AI-based application capable of tracking and analyzing bicep curl exercises in real-time using a standard webcam.</w:t>
       </w:r>
     </w:p>
     <w:p>
@@ -10306,7 +9822,25 @@
                 <w:sz w:val="24"/>
                 <w:szCs w:val="24"/>
               </w:rPr>
-              <w:t xml:space="preserve">OpenCV, NumPy, Pyttsx3, SpeechRecognition, </w:t>
+              <w:t xml:space="preserve">OpenCV, NumPy, Pyttsx3, </w:t>
+            </w:r>
+            <w:proofErr w:type="spellStart"/>
+            <w:r>
+              <w:rPr>
+                <w:rFonts w:ascii="Times New Roman" w:hAnsi="Times New Roman"/>
+                <w:sz w:val="24"/>
+                <w:szCs w:val="24"/>
+              </w:rPr>
+              <w:t>SpeechRecognition</w:t>
+            </w:r>
+            <w:proofErr w:type="spellEnd"/>
+            <w:r>
+              <w:rPr>
+                <w:rFonts w:ascii="Times New Roman" w:hAnsi="Times New Roman"/>
+                <w:sz w:val="24"/>
+                <w:szCs w:val="24"/>
+              </w:rPr>
+              <w:t xml:space="preserve">, </w:t>
             </w:r>
             <w:proofErr w:type="spellStart"/>
             <w:r>
@@ -10324,7 +9858,43 @@
                 <w:sz w:val="24"/>
                 <w:szCs w:val="24"/>
               </w:rPr>
-              <w:t>, Streamlit, and Ultralytics.</w:t>
+              <w:t xml:space="preserve">, </w:t>
+            </w:r>
+            <w:proofErr w:type="spellStart"/>
+            <w:r>
+              <w:rPr>
+                <w:rFonts w:ascii="Times New Roman" w:hAnsi="Times New Roman"/>
+                <w:sz w:val="24"/>
+                <w:szCs w:val="24"/>
+              </w:rPr>
+              <w:t>Streamlit</w:t>
+            </w:r>
+            <w:proofErr w:type="spellEnd"/>
+            <w:r>
+              <w:rPr>
+                <w:rFonts w:ascii="Times New Roman" w:hAnsi="Times New Roman"/>
+                <w:sz w:val="24"/>
+                <w:szCs w:val="24"/>
+              </w:rPr>
+              <w:t xml:space="preserve">, and </w:t>
+            </w:r>
+            <w:proofErr w:type="spellStart"/>
+            <w:r>
+              <w:rPr>
+                <w:rFonts w:ascii="Times New Roman" w:hAnsi="Times New Roman"/>
+                <w:sz w:val="24"/>
+                <w:szCs w:val="24"/>
+              </w:rPr>
+              <w:t>Ultralytics</w:t>
+            </w:r>
+            <w:proofErr w:type="spellEnd"/>
+            <w:r>
+              <w:rPr>
+                <w:rFonts w:ascii="Times New Roman" w:hAnsi="Times New Roman"/>
+                <w:sz w:val="24"/>
+                <w:szCs w:val="24"/>
+              </w:rPr>
+              <w:t>.</w:t>
             </w:r>
           </w:p>
         </w:tc>
@@ -11774,11 +11344,99 @@
         <w:jc w:val="both"/>
         <w:rPr>
           <w:rFonts w:ascii="Times New Roman" w:hAnsi="Times New Roman"/>
-          <w:bCs/>
-          <w:sz w:val="24"/>
-          <w:szCs w:val="24"/>
-        </w:rPr>
-      </w:pPr>
+          <w:b/>
+          <w:sz w:val="24"/>
+          <w:szCs w:val="24"/>
+        </w:rPr>
+      </w:pPr>
+    </w:p>
+    <w:p>
+      <w:pPr>
+        <w:spacing w:before="100" w:beforeAutospacing="1" w:after="40" w:line="360" w:lineRule="auto"/>
+        <w:ind w:left="360"/>
+        <w:jc w:val="both"/>
+        <w:rPr>
+          <w:rFonts w:ascii="Times New Roman" w:hAnsi="Times New Roman"/>
+          <w:b/>
+          <w:sz w:val="24"/>
+          <w:szCs w:val="24"/>
+        </w:rPr>
+      </w:pPr>
+      <w:r>
+        <w:rPr>
+          <w:rFonts w:ascii="Times New Roman" w:hAnsi="Times New Roman"/>
+          <w:b/>
+          <w:sz w:val="24"/>
+          <w:szCs w:val="24"/>
+        </w:rPr>
+        <w:t>Key point and their meaning:</w:t>
+      </w:r>
+    </w:p>
+    <w:p>
+      <w:pPr>
+        <w:spacing w:before="100" w:beforeAutospacing="1" w:after="40" w:line="360" w:lineRule="auto"/>
+        <w:ind w:left="360"/>
+        <w:jc w:val="both"/>
+        <w:rPr>
+          <w:rFonts w:ascii="Times New Roman" w:hAnsi="Times New Roman"/>
+          <w:bCs/>
+          <w:sz w:val="24"/>
+          <w:szCs w:val="24"/>
+        </w:rPr>
+      </w:pPr>
+      <w:r>
+        <w:rPr>
+          <w:noProof/>
+        </w:rPr>
+        <w:drawing>
+          <wp:inline distT="0" distB="0" distL="0" distR="0" wp14:anchorId="0A1563D3" wp14:editId="374CB88A">
+            <wp:extent cx="5579745" cy="3723640"/>
+            <wp:effectExtent l="0" t="0" r="1905" b="0"/>
+            <wp:docPr id="1992047173" name="Picture 3"/>
+            <wp:cNvGraphicFramePr>
+              <a:graphicFrameLocks xmlns:a="http://schemas.openxmlformats.org/drawingml/2006/main" noChangeAspect="1"/>
+            </wp:cNvGraphicFramePr>
+            <a:graphic xmlns:a="http://schemas.openxmlformats.org/drawingml/2006/main">
+              <a:graphicData uri="http://schemas.openxmlformats.org/drawingml/2006/picture">
+                <pic:pic xmlns:pic="http://schemas.openxmlformats.org/drawingml/2006/picture">
+                  <pic:nvPicPr>
+                    <pic:cNvPr id="0" name="Picture 1"/>
+                    <pic:cNvPicPr>
+                      <a:picLocks noChangeAspect="1" noChangeArrowheads="1"/>
+                    </pic:cNvPicPr>
+                  </pic:nvPicPr>
+                  <pic:blipFill>
+                    <a:blip r:embed="rId13" cstate="print">
+                      <a:extLst>
+                        <a:ext uri="{28A0092B-C50C-407E-A947-70E740481C1C}">
+                          <a14:useLocalDpi xmlns:a14="http://schemas.microsoft.com/office/drawing/2010/main" val="0"/>
+                        </a:ext>
+                      </a:extLst>
+                    </a:blip>
+                    <a:srcRect/>
+                    <a:stretch>
+                      <a:fillRect/>
+                    </a:stretch>
+                  </pic:blipFill>
+                  <pic:spPr bwMode="auto">
+                    <a:xfrm>
+                      <a:off x="0" y="0"/>
+                      <a:ext cx="5579745" cy="3723640"/>
+                    </a:xfrm>
+                    <a:prstGeom prst="rect">
+                      <a:avLst/>
+                    </a:prstGeom>
+                    <a:noFill/>
+                    <a:ln>
+                      <a:noFill/>
+                    </a:ln>
+                  </pic:spPr>
+                </pic:pic>
+              </a:graphicData>
+            </a:graphic>
+          </wp:inline>
+        </w:drawing>
+      </w:r>
     </w:p>
     <w:p>
       <w:pPr>
@@ -11816,6 +11474,7 @@
           <w:sz w:val="28"/>
           <w:szCs w:val="28"/>
         </w:rPr>
+        <w:lastRenderedPageBreak/>
         <w:t xml:space="preserve"> </w:t>
       </w:r>
       <w:r>
@@ -11830,8 +11489,29 @@
     </w:p>
     <w:p>
       <w:pPr>
-        <w:spacing w:before="100" w:beforeAutospacing="1" w:after="100" w:afterAutospacing="1" w:line="360" w:lineRule="auto"/>
-        <w:jc w:val="center"/>
+        <w:spacing w:before="100" w:beforeAutospacing="1" w:after="40" w:line="360" w:lineRule="auto"/>
+        <w:ind w:left="360"/>
+        <w:jc w:val="both"/>
+        <w:rPr>
+          <w:rFonts w:ascii="Times New Roman" w:hAnsi="Times New Roman"/>
+          <w:b/>
+          <w:sz w:val="28"/>
+          <w:szCs w:val="28"/>
+        </w:rPr>
+      </w:pPr>
+      <w:hyperlink r:id="rId14" w:history="1">
+        <w:r>
+          <w:rPr>
+            <w:rStyle w:val="Hyperlink"/>
+            <w:rFonts w:ascii="Times New Roman" w:hAnsi="Times New Roman"/>
+            <w:b/>
+            <w:sz w:val="24"/>
+            <w:szCs w:val="24"/>
+          </w:rPr>
+          <w:t>github_link:</w:t>
+        </w:r>
+      </w:hyperlink>
+      <w:r>
         <w:rPr>
           <w:rFonts w:ascii="Times New Roman" w:hAnsi="Times New Roman"/>
           <w:b/>
@@ -11839,16 +11519,26 @@
           <w:sz w:val="32"/>
           <w:szCs w:val="32"/>
         </w:rPr>
-      </w:pPr>
-    </w:p>
-    <w:p>
-      <w:pPr>
-        <w:spacing w:before="100" w:beforeAutospacing="1" w:after="100" w:afterAutospacing="1" w:line="360" w:lineRule="auto"/>
-        <w:jc w:val="center"/>
-        <w:rPr>
-          <w:rFonts w:ascii="Times New Roman" w:hAnsi="Times New Roman"/>
-          <w:b/>
+        <w:t xml:space="preserve"> </w:t>
+      </w:r>
+      <w:r>
+        <w:rPr>
+          <w:rFonts w:ascii="Times New Roman" w:hAnsi="Times New Roman"/>
+          <w:bCs/>
           <w:color w:val="000000"/>
+          <w:sz w:val="24"/>
+          <w:szCs w:val="24"/>
+        </w:rPr>
+        <w:t>https://github.com/Gaikwad1508/Voice-Enabled-AI-Fitness-Tracker</w:t>
+      </w:r>
+    </w:p>
+    <w:p>
+      <w:pPr>
+        <w:spacing w:after="0" w:line="360" w:lineRule="auto"/>
+        <w:rPr>
+          <w:rFonts w:ascii="Times New Roman" w:hAnsi="Times New Roman"/>
+          <w:b/>
+          <w:bCs/>
           <w:sz w:val="32"/>
           <w:szCs w:val="32"/>
         </w:rPr>
@@ -11856,12 +11546,11 @@
     </w:p>
     <w:p>
       <w:pPr>
-        <w:spacing w:before="100" w:beforeAutospacing="1" w:after="100" w:afterAutospacing="1" w:line="360" w:lineRule="auto"/>
-        <w:jc w:val="center"/>
-        <w:rPr>
-          <w:rFonts w:ascii="Times New Roman" w:hAnsi="Times New Roman"/>
-          <w:b/>
-          <w:color w:val="000000"/>
+        <w:spacing w:after="0" w:line="360" w:lineRule="auto"/>
+        <w:rPr>
+          <w:rFonts w:ascii="Times New Roman" w:hAnsi="Times New Roman"/>
+          <w:b/>
+          <w:bCs/>
           <w:sz w:val="32"/>
           <w:szCs w:val="32"/>
         </w:rPr>
@@ -11869,12 +11558,11 @@
     </w:p>
     <w:p>
       <w:pPr>
-        <w:spacing w:before="100" w:beforeAutospacing="1" w:after="100" w:afterAutospacing="1" w:line="360" w:lineRule="auto"/>
-        <w:jc w:val="center"/>
-        <w:rPr>
-          <w:rFonts w:ascii="Times New Roman" w:hAnsi="Times New Roman"/>
-          <w:b/>
-          <w:color w:val="000000"/>
+        <w:spacing w:after="0" w:line="360" w:lineRule="auto"/>
+        <w:rPr>
+          <w:rFonts w:ascii="Times New Roman" w:hAnsi="Times New Roman"/>
+          <w:b/>
+          <w:bCs/>
           <w:sz w:val="32"/>
           <w:szCs w:val="32"/>
         </w:rPr>
@@ -11882,12 +11570,11 @@
     </w:p>
     <w:p>
       <w:pPr>
-        <w:spacing w:before="100" w:beforeAutospacing="1" w:after="100" w:afterAutospacing="1" w:line="360" w:lineRule="auto"/>
-        <w:jc w:val="center"/>
-        <w:rPr>
-          <w:rFonts w:ascii="Times New Roman" w:hAnsi="Times New Roman"/>
-          <w:b/>
-          <w:color w:val="000000"/>
+        <w:spacing w:after="0" w:line="360" w:lineRule="auto"/>
+        <w:rPr>
+          <w:rFonts w:ascii="Times New Roman" w:hAnsi="Times New Roman"/>
+          <w:b/>
+          <w:bCs/>
           <w:sz w:val="32"/>
           <w:szCs w:val="32"/>
         </w:rPr>
@@ -11895,12 +11582,11 @@
     </w:p>
     <w:p>
       <w:pPr>
-        <w:spacing w:before="100" w:beforeAutospacing="1" w:after="100" w:afterAutospacing="1" w:line="360" w:lineRule="auto"/>
-        <w:jc w:val="center"/>
-        <w:rPr>
-          <w:rFonts w:ascii="Times New Roman" w:hAnsi="Times New Roman"/>
-          <w:b/>
-          <w:color w:val="000000"/>
+        <w:spacing w:after="0" w:line="360" w:lineRule="auto"/>
+        <w:rPr>
+          <w:rFonts w:ascii="Times New Roman" w:hAnsi="Times New Roman"/>
+          <w:b/>
+          <w:bCs/>
           <w:sz w:val="32"/>
           <w:szCs w:val="32"/>
         </w:rPr>
@@ -11908,12 +11594,191 @@
     </w:p>
     <w:p>
       <w:pPr>
-        <w:spacing w:before="100" w:beforeAutospacing="1" w:after="100" w:afterAutospacing="1" w:line="360" w:lineRule="auto"/>
-        <w:jc w:val="center"/>
-        <w:rPr>
-          <w:rFonts w:ascii="Times New Roman" w:hAnsi="Times New Roman"/>
-          <w:b/>
-          <w:color w:val="000000"/>
+        <w:spacing w:after="0" w:line="360" w:lineRule="auto"/>
+        <w:rPr>
+          <w:rFonts w:ascii="Times New Roman" w:hAnsi="Times New Roman"/>
+          <w:b/>
+          <w:bCs/>
+          <w:sz w:val="32"/>
+          <w:szCs w:val="32"/>
+        </w:rPr>
+      </w:pPr>
+    </w:p>
+    <w:p>
+      <w:pPr>
+        <w:spacing w:after="0" w:line="360" w:lineRule="auto"/>
+        <w:rPr>
+          <w:rFonts w:ascii="Times New Roman" w:hAnsi="Times New Roman"/>
+          <w:b/>
+          <w:bCs/>
+          <w:sz w:val="32"/>
+          <w:szCs w:val="32"/>
+        </w:rPr>
+      </w:pPr>
+    </w:p>
+    <w:p>
+      <w:pPr>
+        <w:spacing w:after="0" w:line="360" w:lineRule="auto"/>
+        <w:rPr>
+          <w:rFonts w:ascii="Times New Roman" w:hAnsi="Times New Roman"/>
+          <w:b/>
+          <w:bCs/>
+          <w:sz w:val="32"/>
+          <w:szCs w:val="32"/>
+        </w:rPr>
+      </w:pPr>
+    </w:p>
+    <w:p>
+      <w:pPr>
+        <w:spacing w:after="0" w:line="360" w:lineRule="auto"/>
+        <w:rPr>
+          <w:rFonts w:ascii="Times New Roman" w:hAnsi="Times New Roman"/>
+          <w:b/>
+          <w:bCs/>
+          <w:sz w:val="32"/>
+          <w:szCs w:val="32"/>
+        </w:rPr>
+      </w:pPr>
+    </w:p>
+    <w:p>
+      <w:pPr>
+        <w:spacing w:after="0" w:line="360" w:lineRule="auto"/>
+        <w:rPr>
+          <w:rFonts w:ascii="Times New Roman" w:hAnsi="Times New Roman"/>
+          <w:b/>
+          <w:bCs/>
+          <w:sz w:val="32"/>
+          <w:szCs w:val="32"/>
+        </w:rPr>
+      </w:pPr>
+    </w:p>
+    <w:p>
+      <w:pPr>
+        <w:spacing w:after="0" w:line="360" w:lineRule="auto"/>
+        <w:rPr>
+          <w:rFonts w:ascii="Times New Roman" w:hAnsi="Times New Roman"/>
+          <w:b/>
+          <w:bCs/>
+          <w:sz w:val="32"/>
+          <w:szCs w:val="32"/>
+        </w:rPr>
+      </w:pPr>
+    </w:p>
+    <w:p>
+      <w:pPr>
+        <w:spacing w:after="0" w:line="360" w:lineRule="auto"/>
+        <w:rPr>
+          <w:rFonts w:ascii="Times New Roman" w:hAnsi="Times New Roman"/>
+          <w:b/>
+          <w:bCs/>
+          <w:sz w:val="32"/>
+          <w:szCs w:val="32"/>
+        </w:rPr>
+      </w:pPr>
+    </w:p>
+    <w:p>
+      <w:pPr>
+        <w:spacing w:after="0" w:line="360" w:lineRule="auto"/>
+        <w:rPr>
+          <w:rFonts w:ascii="Times New Roman" w:hAnsi="Times New Roman"/>
+          <w:b/>
+          <w:bCs/>
+          <w:sz w:val="32"/>
+          <w:szCs w:val="32"/>
+        </w:rPr>
+      </w:pPr>
+    </w:p>
+    <w:p>
+      <w:pPr>
+        <w:spacing w:after="0" w:line="360" w:lineRule="auto"/>
+        <w:rPr>
+          <w:rFonts w:ascii="Times New Roman" w:hAnsi="Times New Roman"/>
+          <w:b/>
+          <w:bCs/>
+          <w:sz w:val="32"/>
+          <w:szCs w:val="32"/>
+        </w:rPr>
+      </w:pPr>
+    </w:p>
+    <w:p>
+      <w:pPr>
+        <w:spacing w:after="0" w:line="360" w:lineRule="auto"/>
+        <w:rPr>
+          <w:rFonts w:ascii="Times New Roman" w:hAnsi="Times New Roman"/>
+          <w:b/>
+          <w:bCs/>
+          <w:sz w:val="32"/>
+          <w:szCs w:val="32"/>
+        </w:rPr>
+      </w:pPr>
+    </w:p>
+    <w:p>
+      <w:pPr>
+        <w:spacing w:after="0" w:line="360" w:lineRule="auto"/>
+        <w:rPr>
+          <w:rFonts w:ascii="Times New Roman" w:hAnsi="Times New Roman"/>
+          <w:b/>
+          <w:bCs/>
+          <w:sz w:val="32"/>
+          <w:szCs w:val="32"/>
+        </w:rPr>
+      </w:pPr>
+    </w:p>
+    <w:p>
+      <w:pPr>
+        <w:spacing w:after="0" w:line="360" w:lineRule="auto"/>
+        <w:rPr>
+          <w:rFonts w:ascii="Times New Roman" w:hAnsi="Times New Roman"/>
+          <w:b/>
+          <w:bCs/>
+          <w:sz w:val="32"/>
+          <w:szCs w:val="32"/>
+        </w:rPr>
+      </w:pPr>
+    </w:p>
+    <w:p>
+      <w:pPr>
+        <w:spacing w:after="0" w:line="360" w:lineRule="auto"/>
+        <w:rPr>
+          <w:rFonts w:ascii="Times New Roman" w:hAnsi="Times New Roman"/>
+          <w:b/>
+          <w:bCs/>
+          <w:sz w:val="32"/>
+          <w:szCs w:val="32"/>
+        </w:rPr>
+      </w:pPr>
+    </w:p>
+    <w:p>
+      <w:pPr>
+        <w:spacing w:after="0" w:line="360" w:lineRule="auto"/>
+        <w:rPr>
+          <w:rFonts w:ascii="Times New Roman" w:hAnsi="Times New Roman"/>
+          <w:b/>
+          <w:bCs/>
+          <w:sz w:val="32"/>
+          <w:szCs w:val="32"/>
+        </w:rPr>
+      </w:pPr>
+    </w:p>
+    <w:p>
+      <w:pPr>
+        <w:spacing w:after="0" w:line="360" w:lineRule="auto"/>
+        <w:rPr>
+          <w:rFonts w:ascii="Times New Roman" w:hAnsi="Times New Roman"/>
+          <w:b/>
+          <w:bCs/>
+          <w:sz w:val="32"/>
+          <w:szCs w:val="32"/>
+        </w:rPr>
+      </w:pPr>
+    </w:p>
+    <w:p>
+      <w:pPr>
+        <w:spacing w:after="0" w:line="360" w:lineRule="auto"/>
+        <w:rPr>
+          <w:rFonts w:ascii="Times New Roman" w:hAnsi="Times New Roman"/>
+          <w:b/>
+          <w:bCs/>
           <w:sz w:val="32"/>
           <w:szCs w:val="32"/>
         </w:rPr>
@@ -12084,27 +11949,7 @@
           <w:szCs w:val="24"/>
           <w:lang w:val="en-IN" w:eastAsia="en-IN"/>
         </w:rPr>
-        <w:t xml:space="preserve">The current project successfully achieves its objective of tracking and </w:t>
-      </w:r>
-      <w:proofErr w:type="spellStart"/>
-      <w:r>
-        <w:rPr>
-          <w:rFonts w:ascii="Times New Roman" w:eastAsia="Times New Roman" w:hAnsi="Times New Roman"/>
-          <w:sz w:val="24"/>
-          <w:szCs w:val="24"/>
-          <w:lang w:val="en-IN" w:eastAsia="en-IN"/>
-        </w:rPr>
-        <w:t>analyzing</w:t>
-      </w:r>
-      <w:proofErr w:type="spellEnd"/>
-      <w:r>
-        <w:rPr>
-          <w:rFonts w:ascii="Times New Roman" w:eastAsia="Times New Roman" w:hAnsi="Times New Roman"/>
-          <w:sz w:val="24"/>
-          <w:szCs w:val="24"/>
-          <w:lang w:val="en-IN" w:eastAsia="en-IN"/>
-        </w:rPr>
-        <w:t xml:space="preserve"> bicep curls using AI-based pose estimation. However, there are several opportunities for further development and enhancement. Below are suggestions for future work:</w:t>
+        <w:t>The current project successfully achieves its objective of tracking and analyzing bicep curls using AI-based pose estimation. However, there are several opportunities for further development and enhancement. Below are suggestions for future work:</w:t>
       </w:r>
     </w:p>
     <w:p>
@@ -13035,7 +12880,6 @@
     <w:p>
       <w:pPr>
         <w:spacing w:after="160"/>
-        <w:jc w:val="center"/>
         <w:rPr>
           <w:rFonts w:ascii="Times New Roman" w:hAnsi="Times New Roman"/>
           <w:b/>
@@ -13189,30 +13033,14 @@
         </w:rPr>
         <w:t xml:space="preserve"> </w:t>
       </w:r>
-      <w:hyperlink r:id="rId13" w:history="1">
+      <w:hyperlink r:id="rId15" w:history="1">
         <w:r>
           <w:rPr>
             <w:rStyle w:val="Hyperlink"/>
             <w:sz w:val="24"/>
             <w:szCs w:val="24"/>
           </w:rPr>
-          <w:t>https://cloud.google.com/sp</w:t>
-        </w:r>
-        <w:r>
-          <w:rPr>
-            <w:rStyle w:val="Hyperlink"/>
-            <w:sz w:val="24"/>
-            <w:szCs w:val="24"/>
-          </w:rPr>
-          <w:t>e</w:t>
-        </w:r>
-        <w:r>
-          <w:rPr>
-            <w:rStyle w:val="Hyperlink"/>
-            <w:sz w:val="24"/>
-            <w:szCs w:val="24"/>
-          </w:rPr>
-          <w:t>ech-to-text</w:t>
+          <w:t>https://cloud.google.com/speech-to-text</w:t>
         </w:r>
       </w:hyperlink>
     </w:p>
@@ -13365,30 +13193,14 @@
         </w:rPr>
         <w:t xml:space="preserve"> Computer Vision Library, available at </w:t>
       </w:r>
-      <w:hyperlink r:id="rId14" w:tgtFrame="_new" w:history="1">
+      <w:hyperlink r:id="rId16" w:tgtFrame="_new" w:history="1">
         <w:r>
           <w:rPr>
             <w:rStyle w:val="Hyperlink"/>
             <w:sz w:val="24"/>
             <w:szCs w:val="24"/>
           </w:rPr>
-          <w:t>https://open</w:t>
-        </w:r>
-        <w:r>
-          <w:rPr>
-            <w:rStyle w:val="Hyperlink"/>
-            <w:sz w:val="24"/>
-            <w:szCs w:val="24"/>
-          </w:rPr>
-          <w:t>c</w:t>
-        </w:r>
-        <w:r>
-          <w:rPr>
-            <w:rStyle w:val="Hyperlink"/>
-            <w:sz w:val="24"/>
-            <w:szCs w:val="24"/>
-          </w:rPr>
-          <w:t>v.org/</w:t>
+          <w:t>https://opencv.org/</w:t>
         </w:r>
       </w:hyperlink>
       <w:r>
@@ -13420,30 +13232,14 @@
         </w:rPr>
         <w:t xml:space="preserve">NumPy: A Comprehensive Python Library for Numerical Computation, available at </w:t>
       </w:r>
-      <w:hyperlink r:id="rId15" w:tgtFrame="_new" w:history="1">
+      <w:hyperlink r:id="rId17" w:tgtFrame="_new" w:history="1">
         <w:r>
           <w:rPr>
             <w:rStyle w:val="Hyperlink"/>
             <w:sz w:val="24"/>
             <w:szCs w:val="24"/>
           </w:rPr>
-          <w:t>https://nu</w:t>
-        </w:r>
-        <w:r>
-          <w:rPr>
-            <w:rStyle w:val="Hyperlink"/>
-            <w:sz w:val="24"/>
-            <w:szCs w:val="24"/>
-          </w:rPr>
-          <w:t>m</w:t>
-        </w:r>
-        <w:r>
-          <w:rPr>
-            <w:rStyle w:val="Hyperlink"/>
-            <w:sz w:val="24"/>
-            <w:szCs w:val="24"/>
-          </w:rPr>
-          <w:t>py.org/</w:t>
+          <w:t>https://numpy.org/</w:t>
         </w:r>
       </w:hyperlink>
       <w:r>
@@ -13475,30 +13271,14 @@
         </w:rPr>
         <w:t xml:space="preserve">Streamlit: A Framework for Interactive Data Applications, available at </w:t>
       </w:r>
-      <w:hyperlink r:id="rId16" w:tgtFrame="_new" w:history="1">
+      <w:hyperlink r:id="rId18" w:tgtFrame="_new" w:history="1">
         <w:r>
           <w:rPr>
             <w:rStyle w:val="Hyperlink"/>
             <w:sz w:val="24"/>
             <w:szCs w:val="24"/>
           </w:rPr>
-          <w:t>https://</w:t>
-        </w:r>
-        <w:r>
-          <w:rPr>
-            <w:rStyle w:val="Hyperlink"/>
-            <w:sz w:val="24"/>
-            <w:szCs w:val="24"/>
-          </w:rPr>
-          <w:t>s</w:t>
-        </w:r>
-        <w:r>
-          <w:rPr>
-            <w:rStyle w:val="Hyperlink"/>
-            <w:sz w:val="24"/>
-            <w:szCs w:val="24"/>
-          </w:rPr>
-          <w:t>treamlit.io/</w:t>
+          <w:t>https://streamlit.io/</w:t>
         </w:r>
       </w:hyperlink>
       <w:r>
@@ -13530,7 +13310,7 @@
         </w:rPr>
         <w:t xml:space="preserve">SpeechRecognition Python Library, available at </w:t>
       </w:r>
-      <w:hyperlink r:id="rId17" w:tgtFrame="_new" w:history="1">
+      <w:hyperlink r:id="rId19" w:tgtFrame="_new" w:history="1">
         <w:r>
           <w:rPr>
             <w:rStyle w:val="Hyperlink"/>
@@ -13569,7 +13349,7 @@
         </w:rPr>
         <w:t xml:space="preserve">Pyttsx3: Text-to-Speech Conversion Library, available at </w:t>
       </w:r>
-      <w:hyperlink r:id="rId18" w:tgtFrame="_new" w:history="1">
+      <w:hyperlink r:id="rId20" w:tgtFrame="_new" w:history="1">
         <w:r>
           <w:rPr>
             <w:rStyle w:val="Hyperlink"/>
@@ -13684,7 +13464,7 @@
         </w:rPr>
         <w:t xml:space="preserve">Python Programming Language Documentation, available at </w:t>
       </w:r>
-      <w:hyperlink r:id="rId19" w:tgtFrame="_new" w:history="1">
+      <w:hyperlink r:id="rId21" w:tgtFrame="_new" w:history="1">
         <w:r>
           <w:rPr>
             <w:rStyle w:val="Hyperlink"/>
@@ -13723,30 +13503,14 @@
         </w:rPr>
         <w:t xml:space="preserve">CVZone Library Documentation, available at </w:t>
       </w:r>
-      <w:hyperlink r:id="rId20" w:tgtFrame="_new" w:history="1">
+      <w:hyperlink r:id="rId22" w:tgtFrame="_new" w:history="1">
         <w:r>
           <w:rPr>
             <w:rStyle w:val="Hyperlink"/>
             <w:sz w:val="24"/>
             <w:szCs w:val="24"/>
           </w:rPr>
-          <w:t>https://github.com/cvz</w:t>
-        </w:r>
-        <w:r>
-          <w:rPr>
-            <w:rStyle w:val="Hyperlink"/>
-            <w:sz w:val="24"/>
-            <w:szCs w:val="24"/>
-          </w:rPr>
-          <w:t>o</w:t>
-        </w:r>
-        <w:r>
-          <w:rPr>
-            <w:rStyle w:val="Hyperlink"/>
-            <w:sz w:val="24"/>
-            <w:szCs w:val="24"/>
-          </w:rPr>
-          <w:t>ne/cvzone</w:t>
+          <w:t>https://github.com/cvzone/cvzone</w:t>
         </w:r>
       </w:hyperlink>
       <w:r>
@@ -13884,7 +13648,7 @@
       </w:pPr>
     </w:p>
     <w:sectPr>
-      <w:footerReference w:type="default" r:id="rId21"/>
+      <w:footerReference w:type="default" r:id="rId23"/>
       <w:pgSz w:w="11906" w:h="16838" w:code="9"/>
       <w:pgMar w:top="1985" w:right="1134" w:bottom="1134" w:left="1985" w:header="720" w:footer="720" w:gutter="0"/>
       <w:pgBorders w:offsetFrom="page">
@@ -13903,7 +13667,7 @@
 </file>
 
 <file path=word/endnotes.xml><?xml version="1.0" encoding="utf-8"?>
-<w:endnotes xmlns:wpc="http://schemas.microsoft.com/office/word/2010/wordprocessingCanvas" xmlns:cx="http://schemas.microsoft.com/office/drawing/2014/chartex" xmlns:cx1="http://schemas.microsoft.com/office/drawing/2015/9/8/chartex" xmlns:cx2="http://schemas.microsoft.com/office/drawing/2015/10/21/chartex" xmlns:cx3="http://schemas.microsoft.com/office/drawing/2016/5/9/chartex" xmlns:cx4="http://schemas.microsoft.com/office/drawing/2016/5/10/chartex" xmlns:cx5="http://schemas.microsoft.com/office/drawing/2016/5/11/chartex" xmlns:cx6="http://schemas.microsoft.com/office/drawing/2016/5/12/chartex" xmlns:cx7="http://schemas.microsoft.com/office/drawing/2016/5/13/chartex" xmlns:cx8="http://schemas.microsoft.com/office/drawing/2016/5/14/chartex" xmlns:mc="http://schemas.openxmlformats.org/markup-compatibility/2006" xmlns:aink="http://schemas.microsoft.com/office/drawing/2016/ink" xmlns:am3d="http://schemas.microsoft.com/office/drawing/2017/model3d" xmlns:o="urn:schemas-microsoft-com:office:office" xmlns:oel="http://schemas.microsoft.com/office/2019/extlst" xmlns:r="http://schemas.openxmlformats.org/officeDocument/2006/relationships" xmlns:m="http://schemas.openxmlformats.org/officeDocument/2006/math" xmlns:v="urn:schemas-microsoft-com:vml" xmlns:wp14="http://schemas.microsoft.com/office/word/2010/wordprocessingDrawing" xmlns:wp="http://schemas.openxmlformats.org/drawingml/2006/wordprocessingDrawing" xmlns:w10="urn:schemas-microsoft-com:office:word" xmlns:w="http://schemas.openxmlformats.org/wordprocessingml/2006/main" xmlns:w14="http://schemas.microsoft.com/office/word/2010/wordml" xmlns:w15="http://schemas.microsoft.com/office/word/2012/wordml" xmlns:w16cex="http://schemas.microsoft.com/office/word/2018/wordml/cex" xmlns:w16cid="http://schemas.microsoft.com/office/word/2016/wordml/cid" xmlns:w16="http://schemas.microsoft.com/office/word/2018/wordml" xmlns:w16du="http://schemas.microsoft.com/office/word/2023/wordml/word16du" xmlns:w16sdtdh="http://schemas.microsoft.com/office/word/2020/wordml/sdtdatahash" xmlns:w16se="http://schemas.microsoft.com/office/word/2015/wordml/symex" xmlns:wpg="http://schemas.microsoft.com/office/word/2010/wordprocessingGroup" xmlns:wpi="http://schemas.microsoft.com/office/word/2010/wordprocessingInk" xmlns:wne="http://schemas.microsoft.com/office/word/2006/wordml" xmlns:wps="http://schemas.microsoft.com/office/word/2010/wordprocessingShape" mc:Ignorable="w14 w15 w16se w16cid w16 w16cex w16sdtdh w16du wp14">
+<w:endnotes xmlns:wpc="http://schemas.microsoft.com/office/word/2010/wordprocessingCanvas" xmlns:cx="http://schemas.microsoft.com/office/drawing/2014/chartex" xmlns:cx1="http://schemas.microsoft.com/office/drawing/2015/9/8/chartex" xmlns:cx2="http://schemas.microsoft.com/office/drawing/2015/10/21/chartex" xmlns:cx3="http://schemas.microsoft.com/office/drawing/2016/5/9/chartex" xmlns:cx4="http://schemas.microsoft.com/office/drawing/2016/5/10/chartex" xmlns:cx5="http://schemas.microsoft.com/office/drawing/2016/5/11/chartex" xmlns:cx6="http://schemas.microsoft.com/office/drawing/2016/5/12/chartex" xmlns:cx7="http://schemas.microsoft.com/office/drawing/2016/5/13/chartex" xmlns:cx8="http://schemas.microsoft.com/office/drawing/2016/5/14/chartex" xmlns:mc="http://schemas.openxmlformats.org/markup-compatibility/2006" xmlns:aink="http://schemas.microsoft.com/office/drawing/2016/ink" xmlns:am3d="http://schemas.microsoft.com/office/drawing/2017/model3d" xmlns:o="urn:schemas-microsoft-com:office:office" xmlns:oel="http://schemas.microsoft.com/office/2019/extlst" xmlns:r="http://schemas.openxmlformats.org/officeDocument/2006/relationships" xmlns:m="http://schemas.openxmlformats.org/officeDocument/2006/math" xmlns:v="urn:schemas-microsoft-com:vml" xmlns:wp14="http://schemas.microsoft.com/office/word/2010/wordprocessingDrawing" xmlns:wp="http://schemas.openxmlformats.org/drawingml/2006/wordprocessingDrawing" xmlns:w10="urn:schemas-microsoft-com:office:word" xmlns:w="http://schemas.openxmlformats.org/wordprocessingml/2006/main" xmlns:w14="http://schemas.microsoft.com/office/word/2010/wordml" xmlns:w15="http://schemas.microsoft.com/office/word/2012/wordml" xmlns:w16cex="http://schemas.microsoft.com/office/word/2018/wordml/cex" xmlns:w16cid="http://schemas.microsoft.com/office/word/2016/wordml/cid" xmlns:w16="http://schemas.microsoft.com/office/word/2018/wordml" xmlns:w16du="http://schemas.microsoft.com/office/word/2023/wordml/word16du" xmlns:w16sdtdh="http://schemas.microsoft.com/office/word/2020/wordml/sdtdatahash" xmlns:w16sdtfl="http://schemas.microsoft.com/office/word/2024/wordml/sdtformatlock" xmlns:w16se="http://schemas.microsoft.com/office/word/2015/wordml/symex" xmlns:wpg="http://schemas.microsoft.com/office/word/2010/wordprocessingGroup" xmlns:wpi="http://schemas.microsoft.com/office/word/2010/wordprocessingInk" xmlns:wne="http://schemas.microsoft.com/office/word/2006/wordml" xmlns:wps="http://schemas.microsoft.com/office/word/2010/wordprocessingShape" mc:Ignorable="w14 w15 w16se w16cid w16 w16cex w16sdtdh w16sdtfl w16du wp14">
   <w:endnote w:type="separator" w:id="-1">
     <w:p>
       <w:pPr>
@@ -13928,7 +13692,7 @@
 </file>
 
 <file path=word/footer1.xml><?xml version="1.0" encoding="utf-8"?>
-<w:ftr xmlns:wpc="http://schemas.microsoft.com/office/word/2010/wordprocessingCanvas" xmlns:cx="http://schemas.microsoft.com/office/drawing/2014/chartex" xmlns:cx1="http://schemas.microsoft.com/office/drawing/2015/9/8/chartex" xmlns:cx2="http://schemas.microsoft.com/office/drawing/2015/10/21/chartex" xmlns:cx3="http://schemas.microsoft.com/office/drawing/2016/5/9/chartex" xmlns:cx4="http://schemas.microsoft.com/office/drawing/2016/5/10/chartex" xmlns:cx5="http://schemas.microsoft.com/office/drawing/2016/5/11/chartex" xmlns:cx6="http://schemas.microsoft.com/office/drawing/2016/5/12/chartex" xmlns:cx7="http://schemas.microsoft.com/office/drawing/2016/5/13/chartex" xmlns:cx8="http://schemas.microsoft.com/office/drawing/2016/5/14/chartex" xmlns:mc="http://schemas.openxmlformats.org/markup-compatibility/2006" xmlns:aink="http://schemas.microsoft.com/office/drawing/2016/ink" xmlns:am3d="http://schemas.microsoft.com/office/drawing/2017/model3d" xmlns:o="urn:schemas-microsoft-com:office:office" xmlns:oel="http://schemas.microsoft.com/office/2019/extlst" xmlns:r="http://schemas.openxmlformats.org/officeDocument/2006/relationships" xmlns:m="http://schemas.openxmlformats.org/officeDocument/2006/math" xmlns:v="urn:schemas-microsoft-com:vml" xmlns:wp14="http://schemas.microsoft.com/office/word/2010/wordprocessingDrawing" xmlns:wp="http://schemas.openxmlformats.org/drawingml/2006/wordprocessingDrawing" xmlns:w10="urn:schemas-microsoft-com:office:word" xmlns:w="http://schemas.openxmlformats.org/wordprocessingml/2006/main" xmlns:w14="http://schemas.microsoft.com/office/word/2010/wordml" xmlns:w15="http://schemas.microsoft.com/office/word/2012/wordml" xmlns:w16cex="http://schemas.microsoft.com/office/word/2018/wordml/cex" xmlns:w16cid="http://schemas.microsoft.com/office/word/2016/wordml/cid" xmlns:w16="http://schemas.microsoft.com/office/word/2018/wordml" xmlns:w16du="http://schemas.microsoft.com/office/word/2023/wordml/word16du" xmlns:w16sdtdh="http://schemas.microsoft.com/office/word/2020/wordml/sdtdatahash" xmlns:w16se="http://schemas.microsoft.com/office/word/2015/wordml/symex" xmlns:wpg="http://schemas.microsoft.com/office/word/2010/wordprocessingGroup" xmlns:wpi="http://schemas.microsoft.com/office/word/2010/wordprocessingInk" xmlns:wne="http://schemas.microsoft.com/office/word/2006/wordml" xmlns:wps="http://schemas.microsoft.com/office/word/2010/wordprocessingShape" mc:Ignorable="w14 w15 w16se w16cid w16 w16cex w16sdtdh w16du wp14">
+<w:ftr xmlns:wpc="http://schemas.microsoft.com/office/word/2010/wordprocessingCanvas" xmlns:cx="http://schemas.microsoft.com/office/drawing/2014/chartex" xmlns:cx1="http://schemas.microsoft.com/office/drawing/2015/9/8/chartex" xmlns:cx2="http://schemas.microsoft.com/office/drawing/2015/10/21/chartex" xmlns:cx3="http://schemas.microsoft.com/office/drawing/2016/5/9/chartex" xmlns:cx4="http://schemas.microsoft.com/office/drawing/2016/5/10/chartex" xmlns:cx5="http://schemas.microsoft.com/office/drawing/2016/5/11/chartex" xmlns:cx6="http://schemas.microsoft.com/office/drawing/2016/5/12/chartex" xmlns:cx7="http://schemas.microsoft.com/office/drawing/2016/5/13/chartex" xmlns:cx8="http://schemas.microsoft.com/office/drawing/2016/5/14/chartex" xmlns:mc="http://schemas.openxmlformats.org/markup-compatibility/2006" xmlns:aink="http://schemas.microsoft.com/office/drawing/2016/ink" xmlns:am3d="http://schemas.microsoft.com/office/drawing/2017/model3d" xmlns:o="urn:schemas-microsoft-com:office:office" xmlns:oel="http://schemas.microsoft.com/office/2019/extlst" xmlns:r="http://schemas.openxmlformats.org/officeDocument/2006/relationships" xmlns:m="http://schemas.openxmlformats.org/officeDocument/2006/math" xmlns:v="urn:schemas-microsoft-com:vml" xmlns:wp14="http://schemas.microsoft.com/office/word/2010/wordprocessingDrawing" xmlns:wp="http://schemas.openxmlformats.org/drawingml/2006/wordprocessingDrawing" xmlns:w10="urn:schemas-microsoft-com:office:word" xmlns:w="http://schemas.openxmlformats.org/wordprocessingml/2006/main" xmlns:w14="http://schemas.microsoft.com/office/word/2010/wordml" xmlns:w15="http://schemas.microsoft.com/office/word/2012/wordml" xmlns:w16cex="http://schemas.microsoft.com/office/word/2018/wordml/cex" xmlns:w16cid="http://schemas.microsoft.com/office/word/2016/wordml/cid" xmlns:w16="http://schemas.microsoft.com/office/word/2018/wordml" xmlns:w16du="http://schemas.microsoft.com/office/word/2023/wordml/word16du" xmlns:w16sdtdh="http://schemas.microsoft.com/office/word/2020/wordml/sdtdatahash" xmlns:w16sdtfl="http://schemas.microsoft.com/office/word/2024/wordml/sdtformatlock" xmlns:w16se="http://schemas.microsoft.com/office/word/2015/wordml/symex" xmlns:wpg="http://schemas.microsoft.com/office/word/2010/wordprocessingGroup" xmlns:wpi="http://schemas.microsoft.com/office/word/2010/wordprocessingInk" xmlns:wne="http://schemas.microsoft.com/office/word/2006/wordml" xmlns:wps="http://schemas.microsoft.com/office/word/2010/wordprocessingShape" mc:Ignorable="w14 w15 w16se w16cid w16 w16cex w16sdtdh w16sdtfl w16du wp14">
   <w:p>
     <w:pPr>
       <w:pStyle w:val="Footer"/>
@@ -13942,7 +13706,7 @@
 </file>
 
 <file path=word/footer2.xml><?xml version="1.0" encoding="utf-8"?>
-<w:ftr xmlns:wpc="http://schemas.microsoft.com/office/word/2010/wordprocessingCanvas" xmlns:cx="http://schemas.microsoft.com/office/drawing/2014/chartex" xmlns:cx1="http://schemas.microsoft.com/office/drawing/2015/9/8/chartex" xmlns:cx2="http://schemas.microsoft.com/office/drawing/2015/10/21/chartex" xmlns:cx3="http://schemas.microsoft.com/office/drawing/2016/5/9/chartex" xmlns:cx4="http://schemas.microsoft.com/office/drawing/2016/5/10/chartex" xmlns:cx5="http://schemas.microsoft.com/office/drawing/2016/5/11/chartex" xmlns:cx6="http://schemas.microsoft.com/office/drawing/2016/5/12/chartex" xmlns:cx7="http://schemas.microsoft.com/office/drawing/2016/5/13/chartex" xmlns:cx8="http://schemas.microsoft.com/office/drawing/2016/5/14/chartex" xmlns:mc="http://schemas.openxmlformats.org/markup-compatibility/2006" xmlns:aink="http://schemas.microsoft.com/office/drawing/2016/ink" xmlns:am3d="http://schemas.microsoft.com/office/drawing/2017/model3d" xmlns:o="urn:schemas-microsoft-com:office:office" xmlns:oel="http://schemas.microsoft.com/office/2019/extlst" xmlns:r="http://schemas.openxmlformats.org/officeDocument/2006/relationships" xmlns:m="http://schemas.openxmlformats.org/officeDocument/2006/math" xmlns:v="urn:schemas-microsoft-com:vml" xmlns:wp14="http://schemas.microsoft.com/office/word/2010/wordprocessingDrawing" xmlns:wp="http://schemas.openxmlformats.org/drawingml/2006/wordprocessingDrawing" xmlns:w10="urn:schemas-microsoft-com:office:word" xmlns:w="http://schemas.openxmlformats.org/wordprocessingml/2006/main" xmlns:w14="http://schemas.microsoft.com/office/word/2010/wordml" xmlns:w15="http://schemas.microsoft.com/office/word/2012/wordml" xmlns:w16cex="http://schemas.microsoft.com/office/word/2018/wordml/cex" xmlns:w16cid="http://schemas.microsoft.com/office/word/2016/wordml/cid" xmlns:w16="http://schemas.microsoft.com/office/word/2018/wordml" xmlns:w16du="http://schemas.microsoft.com/office/word/2023/wordml/word16du" xmlns:w16sdtdh="http://schemas.microsoft.com/office/word/2020/wordml/sdtdatahash" xmlns:w16se="http://schemas.microsoft.com/office/word/2015/wordml/symex" xmlns:wpg="http://schemas.microsoft.com/office/word/2010/wordprocessingGroup" xmlns:wpi="http://schemas.microsoft.com/office/word/2010/wordprocessingInk" xmlns:wne="http://schemas.microsoft.com/office/word/2006/wordml" xmlns:wps="http://schemas.microsoft.com/office/word/2010/wordprocessingShape" mc:Ignorable="w14 w15 w16se w16cid w16 w16cex w16sdtdh w16du wp14">
+<w:ftr xmlns:wpc="http://schemas.microsoft.com/office/word/2010/wordprocessingCanvas" xmlns:cx="http://schemas.microsoft.com/office/drawing/2014/chartex" xmlns:cx1="http://schemas.microsoft.com/office/drawing/2015/9/8/chartex" xmlns:cx2="http://schemas.microsoft.com/office/drawing/2015/10/21/chartex" xmlns:cx3="http://schemas.microsoft.com/office/drawing/2016/5/9/chartex" xmlns:cx4="http://schemas.microsoft.com/office/drawing/2016/5/10/chartex" xmlns:cx5="http://schemas.microsoft.com/office/drawing/2016/5/11/chartex" xmlns:cx6="http://schemas.microsoft.com/office/drawing/2016/5/12/chartex" xmlns:cx7="http://schemas.microsoft.com/office/drawing/2016/5/13/chartex" xmlns:cx8="http://schemas.microsoft.com/office/drawing/2016/5/14/chartex" xmlns:mc="http://schemas.openxmlformats.org/markup-compatibility/2006" xmlns:aink="http://schemas.microsoft.com/office/drawing/2016/ink" xmlns:am3d="http://schemas.microsoft.com/office/drawing/2017/model3d" xmlns:o="urn:schemas-microsoft-com:office:office" xmlns:oel="http://schemas.microsoft.com/office/2019/extlst" xmlns:r="http://schemas.openxmlformats.org/officeDocument/2006/relationships" xmlns:m="http://schemas.openxmlformats.org/officeDocument/2006/math" xmlns:v="urn:schemas-microsoft-com:vml" xmlns:wp14="http://schemas.microsoft.com/office/word/2010/wordprocessingDrawing" xmlns:wp="http://schemas.openxmlformats.org/drawingml/2006/wordprocessingDrawing" xmlns:w10="urn:schemas-microsoft-com:office:word" xmlns:w="http://schemas.openxmlformats.org/wordprocessingml/2006/main" xmlns:w14="http://schemas.microsoft.com/office/word/2010/wordml" xmlns:w15="http://schemas.microsoft.com/office/word/2012/wordml" xmlns:w16cex="http://schemas.microsoft.com/office/word/2018/wordml/cex" xmlns:w16cid="http://schemas.microsoft.com/office/word/2016/wordml/cid" xmlns:w16="http://schemas.microsoft.com/office/word/2018/wordml" xmlns:w16du="http://schemas.microsoft.com/office/word/2023/wordml/word16du" xmlns:w16sdtdh="http://schemas.microsoft.com/office/word/2020/wordml/sdtdatahash" xmlns:w16sdtfl="http://schemas.microsoft.com/office/word/2024/wordml/sdtformatlock" xmlns:w16se="http://schemas.microsoft.com/office/word/2015/wordml/symex" xmlns:wpg="http://schemas.microsoft.com/office/word/2010/wordprocessingGroup" xmlns:wpi="http://schemas.microsoft.com/office/word/2010/wordprocessingInk" xmlns:wne="http://schemas.microsoft.com/office/word/2006/wordml" xmlns:wps="http://schemas.microsoft.com/office/word/2010/wordprocessingShape" mc:Ignorable="w14 w15 w16se w16cid w16 w16cex w16sdtdh w16sdtfl w16du wp14">
   <w:p>
     <w:pPr>
       <w:pStyle w:val="Footer"/>
@@ -14118,7 +13882,7 @@
 </file>
 
 <file path=word/footnotes.xml><?xml version="1.0" encoding="utf-8"?>
-<w:footnotes xmlns:wpc="http://schemas.microsoft.com/office/word/2010/wordprocessingCanvas" xmlns:cx="http://schemas.microsoft.com/office/drawing/2014/chartex" xmlns:cx1="http://schemas.microsoft.com/office/drawing/2015/9/8/chartex" xmlns:cx2="http://schemas.microsoft.com/office/drawing/2015/10/21/chartex" xmlns:cx3="http://schemas.microsoft.com/office/drawing/2016/5/9/chartex" xmlns:cx4="http://schemas.microsoft.com/office/drawing/2016/5/10/chartex" xmlns:cx5="http://schemas.microsoft.com/office/drawing/2016/5/11/chartex" xmlns:cx6="http://schemas.microsoft.com/office/drawing/2016/5/12/chartex" xmlns:cx7="http://schemas.microsoft.com/office/drawing/2016/5/13/chartex" xmlns:cx8="http://schemas.microsoft.com/office/drawing/2016/5/14/chartex" xmlns:mc="http://schemas.openxmlformats.org/markup-compatibility/2006" xmlns:aink="http://schemas.microsoft.com/office/drawing/2016/ink" xmlns:am3d="http://schemas.microsoft.com/office/drawing/2017/model3d" xmlns:o="urn:schemas-microsoft-com:office:office" xmlns:oel="http://schemas.microsoft.com/office/2019/extlst" xmlns:r="http://schemas.openxmlformats.org/officeDocument/2006/relationships" xmlns:m="http://schemas.openxmlformats.org/officeDocument/2006/math" xmlns:v="urn:schemas-microsoft-com:vml" xmlns:wp14="http://schemas.microsoft.com/office/word/2010/wordprocessingDrawing" xmlns:wp="http://schemas.openxmlformats.org/drawingml/2006/wordprocessingDrawing" xmlns:w10="urn:schemas-microsoft-com:office:word" xmlns:w="http://schemas.openxmlformats.org/wordprocessingml/2006/main" xmlns:w14="http://schemas.microsoft.com/office/word/2010/wordml" xmlns:w15="http://schemas.microsoft.com/office/word/2012/wordml" xmlns:w16cex="http://schemas.microsoft.com/office/word/2018/wordml/cex" xmlns:w16cid="http://schemas.microsoft.com/office/word/2016/wordml/cid" xmlns:w16="http://schemas.microsoft.com/office/word/2018/wordml" xmlns:w16du="http://schemas.microsoft.com/office/word/2023/wordml/word16du" xmlns:w16sdtdh="http://schemas.microsoft.com/office/word/2020/wordml/sdtdatahash" xmlns:w16se="http://schemas.microsoft.com/office/word/2015/wordml/symex" xmlns:wpg="http://schemas.microsoft.com/office/word/2010/wordprocessingGroup" xmlns:wpi="http://schemas.microsoft.com/office/word/2010/wordprocessingInk" xmlns:wne="http://schemas.microsoft.com/office/word/2006/wordml" xmlns:wps="http://schemas.microsoft.com/office/word/2010/wordprocessingShape" mc:Ignorable="w14 w15 w16se w16cid w16 w16cex w16sdtdh w16du wp14">
+<w:footnotes xmlns:wpc="http://schemas.microsoft.com/office/word/2010/wordprocessingCanvas" xmlns:cx="http://schemas.microsoft.com/office/drawing/2014/chartex" xmlns:cx1="http://schemas.microsoft.com/office/drawing/2015/9/8/chartex" xmlns:cx2="http://schemas.microsoft.com/office/drawing/2015/10/21/chartex" xmlns:cx3="http://schemas.microsoft.com/office/drawing/2016/5/9/chartex" xmlns:cx4="http://schemas.microsoft.com/office/drawing/2016/5/10/chartex" xmlns:cx5="http://schemas.microsoft.com/office/drawing/2016/5/11/chartex" xmlns:cx6="http://schemas.microsoft.com/office/drawing/2016/5/12/chartex" xmlns:cx7="http://schemas.microsoft.com/office/drawing/2016/5/13/chartex" xmlns:cx8="http://schemas.microsoft.com/office/drawing/2016/5/14/chartex" xmlns:mc="http://schemas.openxmlformats.org/markup-compatibility/2006" xmlns:aink="http://schemas.microsoft.com/office/drawing/2016/ink" xmlns:am3d="http://schemas.microsoft.com/office/drawing/2017/model3d" xmlns:o="urn:schemas-microsoft-com:office:office" xmlns:oel="http://schemas.microsoft.com/office/2019/extlst" xmlns:r="http://schemas.openxmlformats.org/officeDocument/2006/relationships" xmlns:m="http://schemas.openxmlformats.org/officeDocument/2006/math" xmlns:v="urn:schemas-microsoft-com:vml" xmlns:wp14="http://schemas.microsoft.com/office/word/2010/wordprocessingDrawing" xmlns:wp="http://schemas.openxmlformats.org/drawingml/2006/wordprocessingDrawing" xmlns:w10="urn:schemas-microsoft-com:office:word" xmlns:w="http://schemas.openxmlformats.org/wordprocessingml/2006/main" xmlns:w14="http://schemas.microsoft.com/office/word/2010/wordml" xmlns:w15="http://schemas.microsoft.com/office/word/2012/wordml" xmlns:w16cex="http://schemas.microsoft.com/office/word/2018/wordml/cex" xmlns:w16cid="http://schemas.microsoft.com/office/word/2016/wordml/cid" xmlns:w16="http://schemas.microsoft.com/office/word/2018/wordml" xmlns:w16du="http://schemas.microsoft.com/office/word/2023/wordml/word16du" xmlns:w16sdtdh="http://schemas.microsoft.com/office/word/2020/wordml/sdtdatahash" xmlns:w16sdtfl="http://schemas.microsoft.com/office/word/2024/wordml/sdtformatlock" xmlns:w16se="http://schemas.microsoft.com/office/word/2015/wordml/symex" xmlns:wpg="http://schemas.microsoft.com/office/word/2010/wordprocessingGroup" xmlns:wpi="http://schemas.microsoft.com/office/word/2010/wordprocessingInk" xmlns:wne="http://schemas.microsoft.com/office/word/2006/wordml" xmlns:wps="http://schemas.microsoft.com/office/word/2010/wordprocessingShape" mc:Ignorable="w14 w15 w16se w16cid w16 w16cex w16sdtdh w16sdtfl w16du wp14">
   <w:footnote w:type="separator" w:id="-1">
     <w:p>
       <w:pPr>
@@ -14143,7 +13907,7 @@
 </file>
 
 <file path=word/header1.xml><?xml version="1.0" encoding="utf-8"?>
-<w:hdr xmlns:wpc="http://schemas.microsoft.com/office/word/2010/wordprocessingCanvas" xmlns:cx="http://schemas.microsoft.com/office/drawing/2014/chartex" xmlns:cx1="http://schemas.microsoft.com/office/drawing/2015/9/8/chartex" xmlns:cx2="http://schemas.microsoft.com/office/drawing/2015/10/21/chartex" xmlns:cx3="http://schemas.microsoft.com/office/drawing/2016/5/9/chartex" xmlns:cx4="http://schemas.microsoft.com/office/drawing/2016/5/10/chartex" xmlns:cx5="http://schemas.microsoft.com/office/drawing/2016/5/11/chartex" xmlns:cx6="http://schemas.microsoft.com/office/drawing/2016/5/12/chartex" xmlns:cx7="http://schemas.microsoft.com/office/drawing/2016/5/13/chartex" xmlns:cx8="http://schemas.microsoft.com/office/drawing/2016/5/14/chartex" xmlns:mc="http://schemas.openxmlformats.org/markup-compatibility/2006" xmlns:aink="http://schemas.microsoft.com/office/drawing/2016/ink" xmlns:am3d="http://schemas.microsoft.com/office/drawing/2017/model3d" xmlns:o="urn:schemas-microsoft-com:office:office" xmlns:oel="http://schemas.microsoft.com/office/2019/extlst" xmlns:r="http://schemas.openxmlformats.org/officeDocument/2006/relationships" xmlns:m="http://schemas.openxmlformats.org/officeDocument/2006/math" xmlns:v="urn:schemas-microsoft-com:vml" xmlns:wp14="http://schemas.microsoft.com/office/word/2010/wordprocessingDrawing" xmlns:wp="http://schemas.openxmlformats.org/drawingml/2006/wordprocessingDrawing" xmlns:w10="urn:schemas-microsoft-com:office:word" xmlns:w="http://schemas.openxmlformats.org/wordprocessingml/2006/main" xmlns:w14="http://schemas.microsoft.com/office/word/2010/wordml" xmlns:w15="http://schemas.microsoft.com/office/word/2012/wordml" xmlns:w16cex="http://schemas.microsoft.com/office/word/2018/wordml/cex" xmlns:w16cid="http://schemas.microsoft.com/office/word/2016/wordml/cid" xmlns:w16="http://schemas.microsoft.com/office/word/2018/wordml" xmlns:w16du="http://schemas.microsoft.com/office/word/2023/wordml/word16du" xmlns:w16sdtdh="http://schemas.microsoft.com/office/word/2020/wordml/sdtdatahash" xmlns:w16se="http://schemas.microsoft.com/office/word/2015/wordml/symex" xmlns:wpg="http://schemas.microsoft.com/office/word/2010/wordprocessingGroup" xmlns:wpi="http://schemas.microsoft.com/office/word/2010/wordprocessingInk" xmlns:wne="http://schemas.microsoft.com/office/word/2006/wordml" xmlns:wps="http://schemas.microsoft.com/office/word/2010/wordprocessingShape" mc:Ignorable="w14 w15 w16se w16cid w16 w16cex w16sdtdh w16du wp14">
+<w:hdr xmlns:wpc="http://schemas.microsoft.com/office/word/2010/wordprocessingCanvas" xmlns:cx="http://schemas.microsoft.com/office/drawing/2014/chartex" xmlns:cx1="http://schemas.microsoft.com/office/drawing/2015/9/8/chartex" xmlns:cx2="http://schemas.microsoft.com/office/drawing/2015/10/21/chartex" xmlns:cx3="http://schemas.microsoft.com/office/drawing/2016/5/9/chartex" xmlns:cx4="http://schemas.microsoft.com/office/drawing/2016/5/10/chartex" xmlns:cx5="http://schemas.microsoft.com/office/drawing/2016/5/11/chartex" xmlns:cx6="http://schemas.microsoft.com/office/drawing/2016/5/12/chartex" xmlns:cx7="http://schemas.microsoft.com/office/drawing/2016/5/13/chartex" xmlns:cx8="http://schemas.microsoft.com/office/drawing/2016/5/14/chartex" xmlns:mc="http://schemas.openxmlformats.org/markup-compatibility/2006" xmlns:aink="http://schemas.microsoft.com/office/drawing/2016/ink" xmlns:am3d="http://schemas.microsoft.com/office/drawing/2017/model3d" xmlns:o="urn:schemas-microsoft-com:office:office" xmlns:oel="http://schemas.microsoft.com/office/2019/extlst" xmlns:r="http://schemas.openxmlformats.org/officeDocument/2006/relationships" xmlns:m="http://schemas.openxmlformats.org/officeDocument/2006/math" xmlns:v="urn:schemas-microsoft-com:vml" xmlns:wp14="http://schemas.microsoft.com/office/word/2010/wordprocessingDrawing" xmlns:wp="http://schemas.openxmlformats.org/drawingml/2006/wordprocessingDrawing" xmlns:w10="urn:schemas-microsoft-com:office:word" xmlns:w="http://schemas.openxmlformats.org/wordprocessingml/2006/main" xmlns:w14="http://schemas.microsoft.com/office/word/2010/wordml" xmlns:w15="http://schemas.microsoft.com/office/word/2012/wordml" xmlns:w16cex="http://schemas.microsoft.com/office/word/2018/wordml/cex" xmlns:w16cid="http://schemas.microsoft.com/office/word/2016/wordml/cid" xmlns:w16="http://schemas.microsoft.com/office/word/2018/wordml" xmlns:w16du="http://schemas.microsoft.com/office/word/2023/wordml/word16du" xmlns:w16sdtdh="http://schemas.microsoft.com/office/word/2020/wordml/sdtdatahash" xmlns:w16sdtfl="http://schemas.microsoft.com/office/word/2024/wordml/sdtformatlock" xmlns:w16se="http://schemas.microsoft.com/office/word/2015/wordml/symex" xmlns:wpg="http://schemas.microsoft.com/office/word/2010/wordprocessingGroup" xmlns:wpi="http://schemas.microsoft.com/office/word/2010/wordprocessingInk" xmlns:wne="http://schemas.microsoft.com/office/word/2006/wordml" xmlns:wps="http://schemas.microsoft.com/office/word/2010/wordprocessingShape" mc:Ignorable="w14 w15 w16se w16cid w16 w16cex w16sdtdh w16sdtfl w16du wp14">
   <w:p>
     <w:pPr>
       <w:pStyle w:val="Header"/>
@@ -14334,7 +14098,7 @@
 </file>
 
 <file path=word/numbering.xml><?xml version="1.0" encoding="utf-8"?>
-<w:numbering xmlns:wpc="http://schemas.microsoft.com/office/word/2010/wordprocessingCanvas" xmlns:cx="http://schemas.microsoft.com/office/drawing/2014/chartex" xmlns:cx1="http://schemas.microsoft.com/office/drawing/2015/9/8/chartex" xmlns:cx2="http://schemas.microsoft.com/office/drawing/2015/10/21/chartex" xmlns:cx3="http://schemas.microsoft.com/office/drawing/2016/5/9/chartex" xmlns:cx4="http://schemas.microsoft.com/office/drawing/2016/5/10/chartex" xmlns:cx5="http://schemas.microsoft.com/office/drawing/2016/5/11/chartex" xmlns:cx6="http://schemas.microsoft.com/office/drawing/2016/5/12/chartex" xmlns:cx7="http://schemas.microsoft.com/office/drawing/2016/5/13/chartex" xmlns:cx8="http://schemas.microsoft.com/office/drawing/2016/5/14/chartex" xmlns:mc="http://schemas.openxmlformats.org/markup-compatibility/2006" xmlns:aink="http://schemas.microsoft.com/office/drawing/2016/ink" xmlns:am3d="http://schemas.microsoft.com/office/drawing/2017/model3d" xmlns:o="urn:schemas-microsoft-com:office:office" xmlns:oel="http://schemas.microsoft.com/office/2019/extlst" xmlns:r="http://schemas.openxmlformats.org/officeDocument/2006/relationships" xmlns:m="http://schemas.openxmlformats.org/officeDocument/2006/math" xmlns:v="urn:schemas-microsoft-com:vml" xmlns:wp14="http://schemas.microsoft.com/office/word/2010/wordprocessingDrawing" xmlns:wp="http://schemas.openxmlformats.org/drawingml/2006/wordprocessingDrawing" xmlns:w10="urn:schemas-microsoft-com:office:word" xmlns:w="http://schemas.openxmlformats.org/wordprocessingml/2006/main" xmlns:w14="http://schemas.microsoft.com/office/word/2010/wordml" xmlns:w15="http://schemas.microsoft.com/office/word/2012/wordml" xmlns:w16cex="http://schemas.microsoft.com/office/word/2018/wordml/cex" xmlns:w16cid="http://schemas.microsoft.com/office/word/2016/wordml/cid" xmlns:w16="http://schemas.microsoft.com/office/word/2018/wordml" xmlns:w16du="http://schemas.microsoft.com/office/word/2023/wordml/word16du" xmlns:w16sdtdh="http://schemas.microsoft.com/office/word/2020/wordml/sdtdatahash" xmlns:w16se="http://schemas.microsoft.com/office/word/2015/wordml/symex" xmlns:wpg="http://schemas.microsoft.com/office/word/2010/wordprocessingGroup" xmlns:wpi="http://schemas.microsoft.com/office/word/2010/wordprocessingInk" xmlns:wne="http://schemas.microsoft.com/office/word/2006/wordml" xmlns:wps="http://schemas.microsoft.com/office/word/2010/wordprocessingShape" mc:Ignorable="w14 w15 w16se w16cid w16 w16cex w16sdtdh w16du wp14">
+<w:numbering xmlns:wpc="http://schemas.microsoft.com/office/word/2010/wordprocessingCanvas" xmlns:cx="http://schemas.microsoft.com/office/drawing/2014/chartex" xmlns:cx1="http://schemas.microsoft.com/office/drawing/2015/9/8/chartex" xmlns:cx2="http://schemas.microsoft.com/office/drawing/2015/10/21/chartex" xmlns:cx3="http://schemas.microsoft.com/office/drawing/2016/5/9/chartex" xmlns:cx4="http://schemas.microsoft.com/office/drawing/2016/5/10/chartex" xmlns:cx5="http://schemas.microsoft.com/office/drawing/2016/5/11/chartex" xmlns:cx6="http://schemas.microsoft.com/office/drawing/2016/5/12/chartex" xmlns:cx7="http://schemas.microsoft.com/office/drawing/2016/5/13/chartex" xmlns:cx8="http://schemas.microsoft.com/office/drawing/2016/5/14/chartex" xmlns:mc="http://schemas.openxmlformats.org/markup-compatibility/2006" xmlns:aink="http://schemas.microsoft.com/office/drawing/2016/ink" xmlns:am3d="http://schemas.microsoft.com/office/drawing/2017/model3d" xmlns:o="urn:schemas-microsoft-com:office:office" xmlns:oel="http://schemas.microsoft.com/office/2019/extlst" xmlns:r="http://schemas.openxmlformats.org/officeDocument/2006/relationships" xmlns:m="http://schemas.openxmlformats.org/officeDocument/2006/math" xmlns:v="urn:schemas-microsoft-com:vml" xmlns:wp14="http://schemas.microsoft.com/office/word/2010/wordprocessingDrawing" xmlns:wp="http://schemas.openxmlformats.org/drawingml/2006/wordprocessingDrawing" xmlns:w10="urn:schemas-microsoft-com:office:word" xmlns:w="http://schemas.openxmlformats.org/wordprocessingml/2006/main" xmlns:w14="http://schemas.microsoft.com/office/word/2010/wordml" xmlns:w15="http://schemas.microsoft.com/office/word/2012/wordml" xmlns:w16cex="http://schemas.microsoft.com/office/word/2018/wordml/cex" xmlns:w16cid="http://schemas.microsoft.com/office/word/2016/wordml/cid" xmlns:w16="http://schemas.microsoft.com/office/word/2018/wordml" xmlns:w16du="http://schemas.microsoft.com/office/word/2023/wordml/word16du" xmlns:w16sdtdh="http://schemas.microsoft.com/office/word/2020/wordml/sdtdatahash" xmlns:w16sdtfl="http://schemas.microsoft.com/office/word/2024/wordml/sdtformatlock" xmlns:w16se="http://schemas.microsoft.com/office/word/2015/wordml/symex" xmlns:wpg="http://schemas.microsoft.com/office/word/2010/wordprocessingGroup" xmlns:wpi="http://schemas.microsoft.com/office/word/2010/wordprocessingInk" xmlns:wne="http://schemas.microsoft.com/office/word/2006/wordml" xmlns:wps="http://schemas.microsoft.com/office/word/2010/wordprocessingShape" mc:Ignorable="w14 w15 w16se w16cid w16 w16cex w16sdtdh w16sdtfl w16du wp14">
   <w:abstractNum w:abstractNumId="0" w15:restartNumberingAfterBreak="0">
     <w:nsid w:val="04A3141E"/>
     <w:multiLevelType w:val="multilevel"/>
@@ -17031,7 +16795,7 @@
 </file>
 
 <file path=word/styles.xml><?xml version="1.0" encoding="utf-8"?>
-<w:styles xmlns:mc="http://schemas.openxmlformats.org/markup-compatibility/2006" xmlns:r="http://schemas.openxmlformats.org/officeDocument/2006/relationships" xmlns:w="http://schemas.openxmlformats.org/wordprocessingml/2006/main" xmlns:w14="http://schemas.microsoft.com/office/word/2010/wordml" xmlns:w15="http://schemas.microsoft.com/office/word/2012/wordml" xmlns:w16cex="http://schemas.microsoft.com/office/word/2018/wordml/cex" xmlns:w16cid="http://schemas.microsoft.com/office/word/2016/wordml/cid" xmlns:w16="http://schemas.microsoft.com/office/word/2018/wordml" xmlns:w16du="http://schemas.microsoft.com/office/word/2023/wordml/word16du" xmlns:w16sdtdh="http://schemas.microsoft.com/office/word/2020/wordml/sdtdatahash" xmlns:w16se="http://schemas.microsoft.com/office/word/2015/wordml/symex" mc:Ignorable="w14 w15 w16se w16cid w16 w16cex w16sdtdh w16du">
+<w:styles xmlns:mc="http://schemas.openxmlformats.org/markup-compatibility/2006" xmlns:r="http://schemas.openxmlformats.org/officeDocument/2006/relationships" xmlns:w="http://schemas.openxmlformats.org/wordprocessingml/2006/main" xmlns:w14="http://schemas.microsoft.com/office/word/2010/wordml" xmlns:w15="http://schemas.microsoft.com/office/word/2012/wordml" xmlns:w16cex="http://schemas.microsoft.com/office/word/2018/wordml/cex" xmlns:w16cid="http://schemas.microsoft.com/office/word/2016/wordml/cid" xmlns:w16="http://schemas.microsoft.com/office/word/2018/wordml" xmlns:w16du="http://schemas.microsoft.com/office/word/2023/wordml/word16du" xmlns:w16sdtdh="http://schemas.microsoft.com/office/word/2020/wordml/sdtdatahash" xmlns:w16sdtfl="http://schemas.microsoft.com/office/word/2024/wordml/sdtformatlock" xmlns:w16se="http://schemas.microsoft.com/office/word/2015/wordml/symex" mc:Ignorable="w14 w15 w16se w16cid w16 w16cex w16sdtdh w16sdtfl w16du">
   <w:docDefaults>
     <w:rPrDefault>
       <w:rPr>

</xml_diff>